<commit_message>
Add detailed ETL development report for electricity dataset and update fact table schema
</commit_message>
<xml_diff>
--- a/Structure of Your Final Report.docx
+++ b/Structure of Your Final Report.docx
@@ -108,15 +108,7 @@
     </w:p>
     <w:p>
       <w:r>
-        <w:t xml:space="preserve">   </w:t>
-      </w:r>
-      <w:proofErr w:type="gramStart"/>
-      <w:r>
-        <w:t>5.1 Dimensional</w:t>
-      </w:r>
-      <w:proofErr w:type="gramEnd"/>
-      <w:r>
-        <w:t xml:space="preserve"> Model Overview</w:t>
+        <w:t xml:space="preserve">   5.1 Dimensional Model Overview</w:t>
       </w:r>
     </w:p>
     <w:p>
@@ -1583,15 +1575,7 @@
     </w:p>
     <w:p>
       <w:r>
-        <w:t xml:space="preserve">This </w:t>
-      </w:r>
-      <w:proofErr w:type="gramStart"/>
-      <w:r>
-        <w:t>dataset</w:t>
-      </w:r>
-      <w:proofErr w:type="gramEnd"/>
-      <w:r>
-        <w:t xml:space="preserve"> stores information about participants in the electricity trading system.</w:t>
+        <w:t>This dataset stores information about participants in the electricity trading system.</w:t>
       </w:r>
     </w:p>
     <w:p>
@@ -2265,15 +2249,7 @@
     </w:p>
     <w:p>
       <w:r>
-        <w:t xml:space="preserve">Temporary storage </w:t>
-      </w:r>
-      <w:proofErr w:type="gramStart"/>
-      <w:r>
-        <w:t>used</w:t>
-      </w:r>
-      <w:proofErr w:type="gramEnd"/>
-      <w:r>
-        <w:t xml:space="preserve"> for data cleansing and validation.</w:t>
+        <w:t>Temporary storage used for data cleansing and validation.</w:t>
       </w:r>
     </w:p>
     <w:p>
@@ -2506,34 +2482,17 @@
           <w:bCs/>
         </w:rPr>
       </w:pPr>
-      <w:proofErr w:type="gramStart"/>
-      <w:r>
-        <w:rPr>
-          <w:b/>
-          <w:bCs/>
-        </w:rPr>
-        <w:t>4.1 Dimensional</w:t>
-      </w:r>
-      <w:proofErr w:type="gramEnd"/>
-      <w:r>
-        <w:rPr>
-          <w:b/>
-          <w:bCs/>
-        </w:rPr>
-        <w:t xml:space="preserve"> Model Overview</w:t>
-      </w:r>
-    </w:p>
-    <w:p>
-      <w:r>
-        <w:t xml:space="preserve">The data warehouse is designed </w:t>
-      </w:r>
-      <w:proofErr w:type="gramStart"/>
-      <w:r>
-        <w:t>using</w:t>
-      </w:r>
-      <w:proofErr w:type="gramEnd"/>
-      <w:r>
-        <w:t xml:space="preserve"> a </w:t>
+      <w:r>
+        <w:rPr>
+          <w:b/>
+          <w:bCs/>
+        </w:rPr>
+        <w:t>4.1 Dimensional Model Overview</w:t>
+      </w:r>
+    </w:p>
+    <w:p>
+      <w:r>
+        <w:t xml:space="preserve">The data warehouse is designed using a </w:t>
       </w:r>
       <w:r>
         <w:rPr>
@@ -3880,13 +3839,8 @@
           <w:bCs/>
         </w:rPr>
       </w:pPr>
-      <w:proofErr w:type="gramStart"/>
-      <w:r>
-        <w:t>So</w:t>
-      </w:r>
-      <w:proofErr w:type="gramEnd"/>
-      <w:r>
-        <w:t xml:space="preserve"> you can </w:t>
+      <w:r>
+        <w:t xml:space="preserve">So you can </w:t>
       </w:r>
       <w:r>
         <w:rPr>
@@ -4738,15 +4692,7 @@
     </w:p>
     <w:p>
       <w:r>
-        <w:t xml:space="preserve">To avoid </w:t>
-      </w:r>
-      <w:proofErr w:type="gramStart"/>
-      <w:r>
-        <w:t>duplicate</w:t>
-      </w:r>
-      <w:proofErr w:type="gramEnd"/>
-      <w:r>
-        <w:t xml:space="preserve"> data during repeated ETL executions, staging tables are </w:t>
+        <w:t xml:space="preserve">To avoid duplicate data during repeated ETL executions, staging tables are </w:t>
       </w:r>
       <w:r>
         <w:rPr>
@@ -4808,7 +4754,6 @@
         <w:t xml:space="preserve">TRUNCATE TABLE </w:t>
       </w:r>
       <w:proofErr w:type="spellStart"/>
-      <w:proofErr w:type="gramStart"/>
       <w:r>
         <w:t>StgMarketParticipant</w:t>
       </w:r>
@@ -4816,7 +4761,6 @@
       <w:r>
         <w:t>;</w:t>
       </w:r>
-      <w:proofErr w:type="gramEnd"/>
     </w:p>
     <w:p>
       <w:r>
@@ -5281,15 +5225,7 @@
         <w:t>Slowly Changing Dimension Type 2</w:t>
       </w:r>
       <w:r>
-        <w:t xml:space="preserve"> </w:t>
-      </w:r>
-      <w:proofErr w:type="gramStart"/>
-      <w:r>
-        <w:t>in order to</w:t>
-      </w:r>
-      <w:proofErr w:type="gramEnd"/>
-      <w:r>
-        <w:t xml:space="preserve"> track historical changes in participant roles.</w:t>
+        <w:t xml:space="preserve"> in order to track historical changes in participant roles.</w:t>
       </w:r>
     </w:p>
     <w:p>
@@ -5663,15 +5599,7 @@
         <w:t>StartDate</w:t>
       </w:r>
       <w:r>
-        <w:t xml:space="preserve"> is </w:t>
-      </w:r>
-      <w:proofErr w:type="gramStart"/>
-      <w:r>
-        <w:t>assigned</w:t>
-      </w:r>
-      <w:proofErr w:type="gramEnd"/>
-      <w:r>
-        <w:t xml:space="preserve"> the current system time.</w:t>
+        <w:t xml:space="preserve"> is assigned the current system time.</w:t>
       </w:r>
     </w:p>
     <w:p>
@@ -6220,13 +6148,8 @@
       </w:r>
     </w:p>
     <w:p>
-      <w:proofErr w:type="gramStart"/>
-      <w:r>
-        <w:t>GETDATE(</w:t>
-      </w:r>
-      <w:proofErr w:type="gramEnd"/>
-      <w:r>
-        <w:t>)</w:t>
+      <w:r>
+        <w:t>GETDATE()</w:t>
       </w:r>
     </w:p>
     <w:p>
@@ -6285,19 +6208,63 @@
     <w:p>
       <w:r>
         <w:lastRenderedPageBreak/>
+        <w:t xml:space="preserve">SELECT COUNT(*) AS </w:t>
+      </w:r>
+      <w:proofErr w:type="spellStart"/>
+      <w:r>
+        <w:t>TotalTransactions</w:t>
+      </w:r>
+      <w:proofErr w:type="spellEnd"/>
+    </w:p>
+    <w:p>
+      <w:r>
+        <w:t xml:space="preserve">FROM </w:t>
+      </w:r>
+      <w:proofErr w:type="spellStart"/>
+      <w:r>
+        <w:t>FactEnergyTransaction</w:t>
+      </w:r>
+      <w:proofErr w:type="spellEnd"/>
+      <w:r>
+        <w:t>;</w:t>
+      </w:r>
+    </w:p>
+    <w:p>
+      <w:r>
+        <w:t>Dimension validation:</w:t>
+      </w:r>
+    </w:p>
+    <w:p>
+      <w:r>
         <w:t xml:space="preserve">SELECT </w:t>
       </w:r>
-      <w:proofErr w:type="gramStart"/>
-      <w:r>
-        <w:t>COUNT(</w:t>
-      </w:r>
-      <w:proofErr w:type="gramEnd"/>
-      <w:r>
-        <w:t xml:space="preserve">*) AS </w:t>
-      </w:r>
-      <w:proofErr w:type="spellStart"/>
-      <w:r>
-        <w:t>TotalTransactions</w:t>
+      <w:proofErr w:type="spellStart"/>
+      <w:r>
+        <w:t>ParticipantSK</w:t>
+      </w:r>
+      <w:proofErr w:type="spellEnd"/>
+      <w:r>
+        <w:t xml:space="preserve">, </w:t>
+      </w:r>
+      <w:proofErr w:type="spellStart"/>
+      <w:r>
+        <w:t>user_id</w:t>
+      </w:r>
+      <w:proofErr w:type="spellEnd"/>
+      <w:r>
+        <w:t xml:space="preserve">, </w:t>
+      </w:r>
+      <w:proofErr w:type="spellStart"/>
+      <w:r>
+        <w:t>user_role</w:t>
+      </w:r>
+      <w:proofErr w:type="spellEnd"/>
+      <w:r>
+        <w:t xml:space="preserve">, StartDate, </w:t>
+      </w:r>
+      <w:proofErr w:type="spellStart"/>
+      <w:r>
+        <w:t>EndDate</w:t>
       </w:r>
       <w:proofErr w:type="spellEnd"/>
     </w:p>
@@ -6306,82 +6273,23 @@
         <w:t xml:space="preserve">FROM </w:t>
       </w:r>
       <w:proofErr w:type="spellStart"/>
-      <w:proofErr w:type="gramStart"/>
-      <w:r>
-        <w:t>FactEnergyTransaction</w:t>
+      <w:r>
+        <w:t>DimMarketParticipant</w:t>
+      </w:r>
+      <w:proofErr w:type="spellEnd"/>
+    </w:p>
+    <w:p>
+      <w:r>
+        <w:t xml:space="preserve">ORDER BY </w:t>
+      </w:r>
+      <w:proofErr w:type="spellStart"/>
+      <w:r>
+        <w:t>user_id</w:t>
       </w:r>
       <w:proofErr w:type="spellEnd"/>
       <w:r>
         <w:t>;</w:t>
       </w:r>
-      <w:proofErr w:type="gramEnd"/>
-    </w:p>
-    <w:p>
-      <w:r>
-        <w:t>Dimension validation:</w:t>
-      </w:r>
-    </w:p>
-    <w:p>
-      <w:r>
-        <w:t xml:space="preserve">SELECT </w:t>
-      </w:r>
-      <w:proofErr w:type="spellStart"/>
-      <w:r>
-        <w:t>ParticipantSK</w:t>
-      </w:r>
-      <w:proofErr w:type="spellEnd"/>
-      <w:r>
-        <w:t xml:space="preserve">, </w:t>
-      </w:r>
-      <w:proofErr w:type="spellStart"/>
-      <w:r>
-        <w:t>user_id</w:t>
-      </w:r>
-      <w:proofErr w:type="spellEnd"/>
-      <w:r>
-        <w:t xml:space="preserve">, </w:t>
-      </w:r>
-      <w:proofErr w:type="spellStart"/>
-      <w:r>
-        <w:t>user_role</w:t>
-      </w:r>
-      <w:proofErr w:type="spellEnd"/>
-      <w:r>
-        <w:t xml:space="preserve">, StartDate, </w:t>
-      </w:r>
-      <w:proofErr w:type="spellStart"/>
-      <w:r>
-        <w:t>EndDate</w:t>
-      </w:r>
-      <w:proofErr w:type="spellEnd"/>
-    </w:p>
-    <w:p>
-      <w:r>
-        <w:t xml:space="preserve">FROM </w:t>
-      </w:r>
-      <w:proofErr w:type="spellStart"/>
-      <w:r>
-        <w:t>DimMarketParticipant</w:t>
-      </w:r>
-      <w:proofErr w:type="spellEnd"/>
-    </w:p>
-    <w:p>
-      <w:r>
-        <w:t xml:space="preserve">ORDER BY </w:t>
-      </w:r>
-      <w:proofErr w:type="spellStart"/>
-      <w:r>
-        <w:t>user_</w:t>
-      </w:r>
-      <w:proofErr w:type="gramStart"/>
-      <w:r>
-        <w:t>id</w:t>
-      </w:r>
-      <w:proofErr w:type="spellEnd"/>
-      <w:r>
-        <w:t>;</w:t>
-      </w:r>
-      <w:proofErr w:type="gramEnd"/>
     </w:p>
     <w:p>
       <w:r>
@@ -7076,15 +6984,7 @@
       </w:r>
       <w:proofErr w:type="spellEnd"/>
       <w:r>
-        <w:t xml:space="preserve"> </w:t>
-      </w:r>
-      <w:proofErr w:type="gramStart"/>
-      <w:r>
-        <w:t>= ?</w:t>
-      </w:r>
-      <w:proofErr w:type="gramEnd"/>
-      <w:r>
-        <w:t>,</w:t>
+        <w:t xml:space="preserve"> = ?,</w:t>
       </w:r>
     </w:p>
     <w:p>
@@ -7102,36 +7002,21 @@
     </w:p>
     <w:p>
       <w:r>
-        <w:t xml:space="preserve">        </w:t>
-      </w:r>
-      <w:proofErr w:type="gramStart"/>
-      <w:r>
-        <w:t>DATEDIFF(</w:t>
-      </w:r>
-      <w:proofErr w:type="gramEnd"/>
-      <w:r>
-        <w:t xml:space="preserve">hour, </w:t>
+        <w:t xml:space="preserve">        DATEDIFF(hour, </w:t>
       </w:r>
       <w:proofErr w:type="spellStart"/>
       <w:r>
         <w:t>accm_txn_create_time</w:t>
       </w:r>
       <w:proofErr w:type="spellEnd"/>
-      <w:proofErr w:type="gramStart"/>
-      <w:r>
-        <w:t>, ?</w:t>
-      </w:r>
-      <w:proofErr w:type="gramEnd"/>
-      <w:r>
-        <w:t>)</w:t>
-      </w:r>
-    </w:p>
-    <w:p>
-      <w:proofErr w:type="gramStart"/>
+      <w:r>
+        <w:t>, ?)</w:t>
+      </w:r>
+    </w:p>
+    <w:p>
       <w:r>
         <w:t>WHERE</w:t>
       </w:r>
-      <w:proofErr w:type="gramEnd"/>
     </w:p>
     <w:p>
       <w:r>
@@ -7143,13 +7028,8 @@
       </w:r>
       <w:proofErr w:type="spellEnd"/>
       <w:r>
-        <w:t xml:space="preserve"> </w:t>
-      </w:r>
-      <w:proofErr w:type="gramStart"/>
-      <w:r>
-        <w:t>= ?</w:t>
-      </w:r>
-      <w:proofErr w:type="gramEnd"/>
+        <w:t xml:space="preserve"> = ?</w:t>
+      </w:r>
     </w:p>
     <w:p>
       <w:r>
@@ -7410,13 +7290,8 @@
       </w:r>
       <w:proofErr w:type="spellEnd"/>
       <w:r>
-        <w:t xml:space="preserve"> </w:t>
-      </w:r>
-      <w:proofErr w:type="gramStart"/>
-      <w:r>
-        <w:t>= ?</w:t>
-      </w:r>
-      <w:proofErr w:type="gramEnd"/>
+        <w:t xml:space="preserve"> = ?</w:t>
+      </w:r>
     </w:p>
     <w:p>
       <w:r>
@@ -7587,13 +7462,8 @@
       </w:r>
       <w:proofErr w:type="spellEnd"/>
       <w:r>
-        <w:t xml:space="preserve"> = </w:t>
-      </w:r>
-      <w:proofErr w:type="gramStart"/>
-      <w:r>
-        <w:t>1001;</w:t>
-      </w:r>
-      <w:proofErr w:type="gramEnd"/>
+        <w:t xml:space="preserve"> = 1001;</w:t>
+      </w:r>
     </w:p>
     <w:p>
       <w:r>
@@ -7669,13 +7539,8 @@
           <w:numId w:val="24"/>
         </w:numPr>
       </w:pPr>
-      <w:proofErr w:type="gramStart"/>
-      <w:r>
-        <w:t>the</w:t>
-      </w:r>
-      <w:proofErr w:type="gramEnd"/>
-      <w:r>
-        <w:t xml:space="preserve"> completion timestamp was correctly updated</w:t>
+      <w:r>
+        <w:t>the completion timestamp was correctly updated</w:t>
       </w:r>
     </w:p>
     <w:p>
@@ -7691,15 +7556,7 @@
     </w:p>
     <w:p>
       <w:r>
-        <w:t xml:space="preserve">Example </w:t>
-      </w:r>
-      <w:proofErr w:type="gramStart"/>
-      <w:r>
-        <w:t>result</w:t>
-      </w:r>
-      <w:proofErr w:type="gramEnd"/>
-      <w:r>
-        <w:t>:</w:t>
+        <w:t>Example result:</w:t>
       </w:r>
     </w:p>
     <w:tbl>
@@ -8082,23 +7939,7 @@
           <w:b/>
           <w:bCs/>
         </w:rPr>
-        <w:t xml:space="preserve">the exact screenshots you should take in Visual </w:t>
-      </w:r>
-      <w:proofErr w:type="gramStart"/>
-      <w:r>
-        <w:rPr>
-          <w:b/>
-          <w:bCs/>
-        </w:rPr>
-        <w:t>Studio</w:t>
-      </w:r>
-      <w:proofErr w:type="gramEnd"/>
-      <w:r>
-        <w:rPr>
-          <w:b/>
-          <w:bCs/>
-        </w:rPr>
-        <w:t xml:space="preserve"> so your report looks like a distinction-level DWBI assignment (almost guaranteed 90+ marks)</w:t>
+        <w:t>the exact screenshots you should take in Visual Studio so your report looks like a distinction-level DWBI assignment (almost guaranteed 90+ marks)</w:t>
       </w:r>
       <w:r>
         <w:t>.</w:t>
@@ -8487,13 +8328,8 @@
       <w:proofErr w:type="spellEnd"/>
     </w:p>
     <w:p>
-      <w:proofErr w:type="gramStart"/>
-      <w:r>
-        <w:t>Load</w:t>
-      </w:r>
-      <w:proofErr w:type="gramEnd"/>
-      <w:r>
-        <w:t xml:space="preserve"> </w:t>
+      <w:r>
+        <w:t xml:space="preserve">Load </w:t>
       </w:r>
       <w:proofErr w:type="spellStart"/>
       <w:r>
@@ -8801,15 +8637,7 @@
       </w:r>
       <w:proofErr w:type="spellEnd"/>
       <w:r>
-        <w:t xml:space="preserve"> attribute as a historical attribute, ensuring that any role </w:t>
-      </w:r>
-      <w:proofErr w:type="gramStart"/>
-      <w:r>
-        <w:t>changes create</w:t>
-      </w:r>
-      <w:proofErr w:type="gramEnd"/>
-      <w:r>
-        <w:t xml:space="preserve"> a new dimension record while preserving historical data.</w:t>
+        <w:t xml:space="preserve"> attribute as a historical attribute, ensuring that any role changes create a new dimension record while preserving historical data.</w:t>
       </w:r>
     </w:p>
     <w:p>
@@ -9024,15 +8852,7 @@
     </w:p>
     <w:p>
       <w:r>
-        <w:t xml:space="preserve">Expression: </w:t>
-      </w:r>
-      <w:proofErr w:type="gramStart"/>
-      <w:r>
-        <w:t>GETDATE(</w:t>
-      </w:r>
-      <w:proofErr w:type="gramEnd"/>
-      <w:r>
-        <w:t>)</w:t>
+        <w:t>Expression: GETDATE()</w:t>
       </w:r>
     </w:p>
     <w:p>
@@ -9372,15 +9192,7 @@
       </w:r>
       <w:proofErr w:type="spellEnd"/>
       <w:r>
-        <w:t xml:space="preserve"> </w:t>
-      </w:r>
-      <w:proofErr w:type="gramStart"/>
-      <w:r>
-        <w:t>= ?</w:t>
-      </w:r>
-      <w:proofErr w:type="gramEnd"/>
-      <w:r>
-        <w:t>,</w:t>
+        <w:t xml:space="preserve"> = ?,</w:t>
       </w:r>
     </w:p>
     <w:p>
@@ -9394,34 +9206,22 @@
       </w:r>
     </w:p>
     <w:p>
-      <w:proofErr w:type="gramStart"/>
-      <w:r>
-        <w:t>DATEDIFF(</w:t>
-      </w:r>
-      <w:proofErr w:type="gramEnd"/>
-      <w:r>
-        <w:t xml:space="preserve">hour, </w:t>
+      <w:r>
+        <w:t xml:space="preserve">DATEDIFF(hour, </w:t>
       </w:r>
       <w:proofErr w:type="spellStart"/>
       <w:r>
         <w:t>accm_txn_create_time</w:t>
       </w:r>
       <w:proofErr w:type="spellEnd"/>
-      <w:proofErr w:type="gramStart"/>
-      <w:r>
-        <w:t>, ?</w:t>
-      </w:r>
-      <w:proofErr w:type="gramEnd"/>
-      <w:r>
-        <w:t>)</w:t>
-      </w:r>
-    </w:p>
-    <w:p>
-      <w:proofErr w:type="gramStart"/>
+      <w:r>
+        <w:t>, ?)</w:t>
+      </w:r>
+    </w:p>
+    <w:p>
       <w:r>
         <w:t>WHERE</w:t>
       </w:r>
-      <w:proofErr w:type="gramEnd"/>
     </w:p>
     <w:p>
       <w:proofErr w:type="spellStart"/>
@@ -9430,13 +9230,8 @@
       </w:r>
       <w:proofErr w:type="spellEnd"/>
       <w:r>
-        <w:t xml:space="preserve"> </w:t>
-      </w:r>
-      <w:proofErr w:type="gramStart"/>
-      <w:r>
-        <w:t>= ?</w:t>
-      </w:r>
-      <w:proofErr w:type="gramEnd"/>
+        <w:t xml:space="preserve"> = ?</w:t>
+      </w:r>
     </w:p>
     <w:p>
       <w:r>
@@ -9947,6 +9742,1766 @@
       </w:r>
       <w:r>
         <w:t>.</w:t>
+      </w:r>
+    </w:p>
+    <w:p/>
+    <w:p>
+      <w:r>
+        <w:t xml:space="preserve">Perfect! I can create a full, ready-to-copy </w:t>
+      </w:r>
+      <w:r>
+        <w:rPr>
+          <w:b/>
+          <w:bCs/>
+        </w:rPr>
+        <w:t>Task 5 + Task 6 report</w:t>
+      </w:r>
+      <w:r>
+        <w:t xml:space="preserve"> for your electricity dataset, including:</w:t>
+      </w:r>
+    </w:p>
+    <w:p>
+      <w:pPr>
+        <w:numPr>
+          <w:ilvl w:val="0"/>
+          <w:numId w:val="26"/>
+        </w:numPr>
+      </w:pPr>
+      <w:r>
+        <w:t>SSIS package development steps</w:t>
+      </w:r>
+    </w:p>
+    <w:p>
+      <w:pPr>
+        <w:numPr>
+          <w:ilvl w:val="0"/>
+          <w:numId w:val="26"/>
+        </w:numPr>
+      </w:pPr>
+      <w:r>
+        <w:t>Derived columns, lookups, and transformations</w:t>
+      </w:r>
+    </w:p>
+    <w:p>
+      <w:pPr>
+        <w:numPr>
+          <w:ilvl w:val="0"/>
+          <w:numId w:val="26"/>
+        </w:numPr>
+      </w:pPr>
+      <w:r>
+        <w:t>Stored procedure examples for updates</w:t>
+      </w:r>
+    </w:p>
+    <w:p>
+      <w:pPr>
+        <w:numPr>
+          <w:ilvl w:val="0"/>
+          <w:numId w:val="26"/>
+        </w:numPr>
+      </w:pPr>
+      <w:r>
+        <w:t>Validation queries</w:t>
+      </w:r>
+    </w:p>
+    <w:p>
+      <w:pPr>
+        <w:numPr>
+          <w:ilvl w:val="0"/>
+          <w:numId w:val="26"/>
+        </w:numPr>
+      </w:pPr>
+      <w:r>
+        <w:t>Placeholders for screenshots</w:t>
+      </w:r>
+    </w:p>
+    <w:p>
+      <w:r>
+        <w:lastRenderedPageBreak/>
+        <w:t>I’ll structure it so you can just paste it into your assignment document and insert your screenshots where indicated.</w:t>
+      </w:r>
+    </w:p>
+    <w:p>
+      <w:r>
+        <w:t>Here’s the full report draft:</w:t>
+      </w:r>
+    </w:p>
+    <w:p>
+      <w:r>
+        <w:pict w14:anchorId="6B7A0C58">
+          <v:rect id="_x0000_i1705" style="width:0;height:1.5pt" o:hralign="center" o:hrstd="t" o:hr="t" fillcolor="#a0a0a0" stroked="f"/>
+        </w:pict>
+      </w:r>
+    </w:p>
+    <w:p>
+      <w:pPr>
+        <w:rPr>
+          <w:b/>
+          <w:bCs/>
+        </w:rPr>
+      </w:pPr>
+      <w:r>
+        <w:rPr>
+          <w:b/>
+          <w:bCs/>
+        </w:rPr>
+        <w:t>Task 5: ETL Development for Electricity Dataset</w:t>
+      </w:r>
+    </w:p>
+    <w:p>
+      <w:r>
+        <w:rPr>
+          <w:b/>
+          <w:bCs/>
+        </w:rPr>
+        <w:t>Objective:</w:t>
+      </w:r>
+      <w:r>
+        <w:t xml:space="preserve"> Extract, transform, and load electricity consumption and customer data into the data warehouse.</w:t>
+      </w:r>
+    </w:p>
+    <w:p>
+      <w:pPr>
+        <w:rPr>
+          <w:b/>
+          <w:bCs/>
+        </w:rPr>
+      </w:pPr>
+      <w:r>
+        <w:rPr>
+          <w:b/>
+          <w:bCs/>
+        </w:rPr>
+        <w:t>5.1 ETL Overview</w:t>
+      </w:r>
+    </w:p>
+    <w:p>
+      <w:r>
+        <w:t>For this task, two data sources were used:</w:t>
+      </w:r>
+    </w:p>
+    <w:p>
+      <w:pPr>
+        <w:numPr>
+          <w:ilvl w:val="0"/>
+          <w:numId w:val="27"/>
+        </w:numPr>
+      </w:pPr>
+      <w:r>
+        <w:rPr>
+          <w:b/>
+          <w:bCs/>
+        </w:rPr>
+        <w:t>Customer Data (CSV):</w:t>
+      </w:r>
+      <w:r>
+        <w:t xml:space="preserve"> Contains customer ID, name, address, and subscription type.</w:t>
+      </w:r>
+    </w:p>
+    <w:p>
+      <w:pPr>
+        <w:numPr>
+          <w:ilvl w:val="0"/>
+          <w:numId w:val="27"/>
+        </w:numPr>
+      </w:pPr>
+      <w:r>
+        <w:rPr>
+          <w:b/>
+          <w:bCs/>
+        </w:rPr>
+        <w:t>Electricity Usage Data (SQL Database):</w:t>
+      </w:r>
+      <w:r>
+        <w:t xml:space="preserve"> Contains meter readings, reading date, and usage in kWh.</w:t>
+      </w:r>
+    </w:p>
+    <w:p>
+      <w:r>
+        <w:t>The ETL process ensures:</w:t>
+      </w:r>
+    </w:p>
+    <w:p>
+      <w:pPr>
+        <w:numPr>
+          <w:ilvl w:val="0"/>
+          <w:numId w:val="28"/>
+        </w:numPr>
+      </w:pPr>
+      <w:r>
+        <w:t>Data cleaning (removing nulls, invalid readings)</w:t>
+      </w:r>
+    </w:p>
+    <w:p>
+      <w:pPr>
+        <w:numPr>
+          <w:ilvl w:val="0"/>
+          <w:numId w:val="28"/>
+        </w:numPr>
+      </w:pPr>
+      <w:r>
+        <w:t>Data transformation (date formatting, categorization)</w:t>
+      </w:r>
+    </w:p>
+    <w:p>
+      <w:pPr>
+        <w:numPr>
+          <w:ilvl w:val="0"/>
+          <w:numId w:val="28"/>
+        </w:numPr>
+      </w:pPr>
+      <w:r>
+        <w:t>Integration of multiple sources into the dimensional model</w:t>
+      </w:r>
+    </w:p>
+    <w:p>
+      <w:r>
+        <w:pict w14:anchorId="4438825B">
+          <v:rect id="_x0000_i1706" style="width:0;height:1.5pt" o:hralign="center" o:hrstd="t" o:hr="t" fillcolor="#a0a0a0" stroked="f"/>
+        </w:pict>
+      </w:r>
+    </w:p>
+    <w:p>
+      <w:pPr>
+        <w:rPr>
+          <w:b/>
+          <w:bCs/>
+        </w:rPr>
+      </w:pPr>
+      <w:r>
+        <w:rPr>
+          <w:b/>
+          <w:bCs/>
+        </w:rPr>
+        <w:t>5.2 SSIS Package Design</w:t>
+      </w:r>
+    </w:p>
+    <w:p>
+      <w:r>
+        <w:rPr>
+          <w:b/>
+          <w:bCs/>
+        </w:rPr>
+        <w:t>Package Name:</w:t>
+      </w:r>
+      <w:r>
+        <w:t xml:space="preserve"> </w:t>
+      </w:r>
+      <w:proofErr w:type="spellStart"/>
+      <w:r>
+        <w:t>ETL_Electricity_Load.dtsx</w:t>
+      </w:r>
+      <w:proofErr w:type="spellEnd"/>
+    </w:p>
+    <w:p>
+      <w:r>
+        <w:rPr>
+          <w:b/>
+          <w:bCs/>
+        </w:rPr>
+        <w:t>Control Flow Steps:</w:t>
+      </w:r>
+    </w:p>
+    <w:p>
+      <w:pPr>
+        <w:numPr>
+          <w:ilvl w:val="0"/>
+          <w:numId w:val="29"/>
+        </w:numPr>
+      </w:pPr>
+      <w:r>
+        <w:rPr>
+          <w:b/>
+          <w:bCs/>
+        </w:rPr>
+        <w:t>Data Flow Task – Customer Dimension Load</w:t>
+      </w:r>
+    </w:p>
+    <w:p>
+      <w:pPr>
+        <w:numPr>
+          <w:ilvl w:val="1"/>
+          <w:numId w:val="29"/>
+        </w:numPr>
+      </w:pPr>
+      <w:r>
+        <w:rPr>
+          <w:b/>
+          <w:bCs/>
+        </w:rPr>
+        <w:t>Source:</w:t>
+      </w:r>
+      <w:r>
+        <w:t xml:space="preserve"> CSV file</w:t>
+      </w:r>
+    </w:p>
+    <w:p>
+      <w:pPr>
+        <w:numPr>
+          <w:ilvl w:val="1"/>
+          <w:numId w:val="29"/>
+        </w:numPr>
+      </w:pPr>
+      <w:r>
+        <w:rPr>
+          <w:b/>
+          <w:bCs/>
+        </w:rPr>
+        <w:t>Transformations:</w:t>
+      </w:r>
+    </w:p>
+    <w:p>
+      <w:pPr>
+        <w:numPr>
+          <w:ilvl w:val="2"/>
+          <w:numId w:val="29"/>
+        </w:numPr>
+      </w:pPr>
+      <w:r>
+        <w:t>Data Conversion: Ensure customer ID is integer</w:t>
+      </w:r>
+    </w:p>
+    <w:p>
+      <w:pPr>
+        <w:numPr>
+          <w:ilvl w:val="2"/>
+          <w:numId w:val="29"/>
+        </w:numPr>
+      </w:pPr>
+      <w:r>
+        <w:t xml:space="preserve">Derived Column: Create </w:t>
+      </w:r>
+      <w:proofErr w:type="spellStart"/>
+      <w:r>
+        <w:t>Customer_FullName</w:t>
+      </w:r>
+      <w:proofErr w:type="spellEnd"/>
+      <w:r>
+        <w:t xml:space="preserve"> by concatenating first and last names</w:t>
+      </w:r>
+    </w:p>
+    <w:p>
+      <w:pPr>
+        <w:numPr>
+          <w:ilvl w:val="1"/>
+          <w:numId w:val="29"/>
+        </w:numPr>
+      </w:pPr>
+      <w:r>
+        <w:rPr>
+          <w:b/>
+          <w:bCs/>
+        </w:rPr>
+        <w:lastRenderedPageBreak/>
+        <w:t>Destination:</w:t>
+      </w:r>
+      <w:r>
+        <w:t xml:space="preserve"> </w:t>
+      </w:r>
+      <w:proofErr w:type="spellStart"/>
+      <w:r>
+        <w:t>Dim_Customer</w:t>
+      </w:r>
+      <w:proofErr w:type="spellEnd"/>
+      <w:r>
+        <w:t xml:space="preserve"> table in Data Warehouse</w:t>
+      </w:r>
+    </w:p>
+    <w:p>
+      <w:r>
+        <w:rPr>
+          <w:b/>
+          <w:bCs/>
+        </w:rPr>
+        <w:t>Screenshot Placeholder:</w:t>
+      </w:r>
+      <w:r>
+        <w:t xml:space="preserve"> Insert Customer Dimension Data Flow Screenshot Here</w:t>
+      </w:r>
+    </w:p>
+    <w:p>
+      <w:pPr>
+        <w:numPr>
+          <w:ilvl w:val="0"/>
+          <w:numId w:val="29"/>
+        </w:numPr>
+      </w:pPr>
+      <w:r>
+        <w:rPr>
+          <w:b/>
+          <w:bCs/>
+        </w:rPr>
+        <w:t>Data Flow Task – Date Dimension Load</w:t>
+      </w:r>
+    </w:p>
+    <w:p>
+      <w:pPr>
+        <w:numPr>
+          <w:ilvl w:val="1"/>
+          <w:numId w:val="29"/>
+        </w:numPr>
+      </w:pPr>
+      <w:r>
+        <w:rPr>
+          <w:b/>
+          <w:bCs/>
+        </w:rPr>
+        <w:t>Source:</w:t>
+      </w:r>
+      <w:r>
+        <w:t xml:space="preserve"> SQL query generates date range (1 year)</w:t>
+      </w:r>
+    </w:p>
+    <w:p>
+      <w:pPr>
+        <w:numPr>
+          <w:ilvl w:val="1"/>
+          <w:numId w:val="29"/>
+        </w:numPr>
+      </w:pPr>
+      <w:r>
+        <w:rPr>
+          <w:b/>
+          <w:bCs/>
+        </w:rPr>
+        <w:t>Transformations:</w:t>
+      </w:r>
+    </w:p>
+    <w:p>
+      <w:pPr>
+        <w:numPr>
+          <w:ilvl w:val="2"/>
+          <w:numId w:val="29"/>
+        </w:numPr>
+      </w:pPr>
+      <w:r>
+        <w:t>Derived Column: Extract Year, Month, Day</w:t>
+      </w:r>
+    </w:p>
+    <w:p>
+      <w:pPr>
+        <w:numPr>
+          <w:ilvl w:val="1"/>
+          <w:numId w:val="29"/>
+        </w:numPr>
+      </w:pPr>
+      <w:r>
+        <w:rPr>
+          <w:b/>
+          <w:bCs/>
+        </w:rPr>
+        <w:t>Destination:</w:t>
+      </w:r>
+      <w:r>
+        <w:t xml:space="preserve"> </w:t>
+      </w:r>
+      <w:proofErr w:type="spellStart"/>
+      <w:r>
+        <w:t>Dim_Date</w:t>
+      </w:r>
+      <w:proofErr w:type="spellEnd"/>
+      <w:r>
+        <w:t xml:space="preserve"> table</w:t>
+      </w:r>
+    </w:p>
+    <w:p>
+      <w:r>
+        <w:rPr>
+          <w:b/>
+          <w:bCs/>
+        </w:rPr>
+        <w:t>Screenshot Placeholder:</w:t>
+      </w:r>
+      <w:r>
+        <w:t xml:space="preserve"> Insert Date Dimension Data Flow Screenshot Here</w:t>
+      </w:r>
+    </w:p>
+    <w:p>
+      <w:pPr>
+        <w:numPr>
+          <w:ilvl w:val="0"/>
+          <w:numId w:val="29"/>
+        </w:numPr>
+      </w:pPr>
+      <w:r>
+        <w:rPr>
+          <w:b/>
+          <w:bCs/>
+        </w:rPr>
+        <w:t>Data Flow Task – Electricity Usage Fact Load</w:t>
+      </w:r>
+    </w:p>
+    <w:p>
+      <w:pPr>
+        <w:numPr>
+          <w:ilvl w:val="1"/>
+          <w:numId w:val="29"/>
+        </w:numPr>
+      </w:pPr>
+      <w:r>
+        <w:rPr>
+          <w:b/>
+          <w:bCs/>
+        </w:rPr>
+        <w:t>Source:</w:t>
+      </w:r>
+      <w:r>
+        <w:t xml:space="preserve"> SQL Server table containing meter readings</w:t>
+      </w:r>
+    </w:p>
+    <w:p>
+      <w:pPr>
+        <w:numPr>
+          <w:ilvl w:val="1"/>
+          <w:numId w:val="29"/>
+        </w:numPr>
+      </w:pPr>
+      <w:r>
+        <w:rPr>
+          <w:b/>
+          <w:bCs/>
+        </w:rPr>
+        <w:t>Transformations:</w:t>
+      </w:r>
+    </w:p>
+    <w:p>
+      <w:pPr>
+        <w:numPr>
+          <w:ilvl w:val="2"/>
+          <w:numId w:val="29"/>
+        </w:numPr>
+      </w:pPr>
+      <w:r>
+        <w:t xml:space="preserve">Lookup: Match </w:t>
+      </w:r>
+      <w:proofErr w:type="spellStart"/>
+      <w:r>
+        <w:t>Customer_ID</w:t>
+      </w:r>
+      <w:proofErr w:type="spellEnd"/>
+      <w:r>
+        <w:t xml:space="preserve"> to </w:t>
+      </w:r>
+      <w:proofErr w:type="spellStart"/>
+      <w:r>
+        <w:t>Dim_Customer</w:t>
+      </w:r>
+      <w:proofErr w:type="spellEnd"/>
+    </w:p>
+    <w:p>
+      <w:pPr>
+        <w:numPr>
+          <w:ilvl w:val="2"/>
+          <w:numId w:val="29"/>
+        </w:numPr>
+      </w:pPr>
+      <w:r>
+        <w:t>Derived Column: Convert usage to kWh if needed</w:t>
+      </w:r>
+    </w:p>
+    <w:p>
+      <w:pPr>
+        <w:numPr>
+          <w:ilvl w:val="2"/>
+          <w:numId w:val="29"/>
+        </w:numPr>
+      </w:pPr>
+      <w:r>
+        <w:t>Conditional Split: Remove invalid readings</w:t>
+      </w:r>
+    </w:p>
+    <w:p>
+      <w:pPr>
+        <w:numPr>
+          <w:ilvl w:val="1"/>
+          <w:numId w:val="29"/>
+        </w:numPr>
+      </w:pPr>
+      <w:r>
+        <w:rPr>
+          <w:b/>
+          <w:bCs/>
+        </w:rPr>
+        <w:t>Destination:</w:t>
+      </w:r>
+      <w:r>
+        <w:t xml:space="preserve"> </w:t>
+      </w:r>
+      <w:proofErr w:type="spellStart"/>
+      <w:r>
+        <w:t>Fact_ElectricityUsage</w:t>
+      </w:r>
+      <w:proofErr w:type="spellEnd"/>
+      <w:r>
+        <w:t xml:space="preserve"> table</w:t>
+      </w:r>
+    </w:p>
+    <w:p>
+      <w:r>
+        <w:rPr>
+          <w:b/>
+          <w:bCs/>
+        </w:rPr>
+        <w:t>Screenshot Placeholder:</w:t>
+      </w:r>
+      <w:r>
+        <w:t xml:space="preserve"> Insert Fact Table Data Flow Screenshot Here</w:t>
+      </w:r>
+    </w:p>
+    <w:p>
+      <w:r>
+        <w:pict w14:anchorId="46EDB699">
+          <v:rect id="_x0000_i1707" style="width:0;height:1.5pt" o:hralign="center" o:hrstd="t" o:hr="t" fillcolor="#a0a0a0" stroked="f"/>
+        </w:pict>
+      </w:r>
+    </w:p>
+    <w:p>
+      <w:pPr>
+        <w:rPr>
+          <w:b/>
+          <w:bCs/>
+        </w:rPr>
+      </w:pPr>
+      <w:r>
+        <w:rPr>
+          <w:b/>
+          <w:bCs/>
+        </w:rPr>
+        <w:t>5.3 ETL Transformations Used</w:t>
+      </w:r>
+    </w:p>
+    <w:tbl>
+      <w:tblPr>
+        <w:tblW w:w="0" w:type="auto"/>
+        <w:tblCellSpacing w:w="15" w:type="dxa"/>
+        <w:tblCellMar>
+          <w:top w:w="15" w:type="dxa"/>
+          <w:left w:w="15" w:type="dxa"/>
+          <w:bottom w:w="15" w:type="dxa"/>
+          <w:right w:w="15" w:type="dxa"/>
+        </w:tblCellMar>
+        <w:tblLook w:val="04A0" w:firstRow="1" w:lastRow="0" w:firstColumn="1" w:lastColumn="0" w:noHBand="0" w:noVBand="1"/>
+      </w:tblPr>
+      <w:tblGrid>
+        <w:gridCol w:w="1911"/>
+        <w:gridCol w:w="5489"/>
+      </w:tblGrid>
+      <w:tr>
+        <w:trPr>
+          <w:tblHeader/>
+          <w:tblCellSpacing w:w="15" w:type="dxa"/>
+        </w:trPr>
+        <w:tc>
+          <w:tcPr>
+            <w:tcW w:w="0" w:type="auto"/>
+            <w:vAlign w:val="center"/>
+            <w:hideMark/>
+          </w:tcPr>
+          <w:p>
+            <w:pPr>
+              <w:rPr>
+                <w:b/>
+                <w:bCs/>
+              </w:rPr>
+            </w:pPr>
+            <w:r>
+              <w:rPr>
+                <w:b/>
+                <w:bCs/>
+              </w:rPr>
+              <w:t>Transformation</w:t>
+            </w:r>
+          </w:p>
+        </w:tc>
+        <w:tc>
+          <w:tcPr>
+            <w:tcW w:w="0" w:type="auto"/>
+            <w:vAlign w:val="center"/>
+            <w:hideMark/>
+          </w:tcPr>
+          <w:p>
+            <w:pPr>
+              <w:rPr>
+                <w:b/>
+                <w:bCs/>
+              </w:rPr>
+            </w:pPr>
+            <w:r>
+              <w:rPr>
+                <w:b/>
+                <w:bCs/>
+              </w:rPr>
+              <w:t>Purpose</w:t>
+            </w:r>
+          </w:p>
+        </w:tc>
+      </w:tr>
+      <w:tr>
+        <w:trPr>
+          <w:tblCellSpacing w:w="15" w:type="dxa"/>
+        </w:trPr>
+        <w:tc>
+          <w:tcPr>
+            <w:tcW w:w="0" w:type="auto"/>
+            <w:vAlign w:val="center"/>
+            <w:hideMark/>
+          </w:tcPr>
+          <w:p>
+            <w:r>
+              <w:rPr>
+                <w:b/>
+                <w:bCs/>
+              </w:rPr>
+              <w:t>Data Conversion</w:t>
+            </w:r>
+          </w:p>
+        </w:tc>
+        <w:tc>
+          <w:tcPr>
+            <w:tcW w:w="0" w:type="auto"/>
+            <w:vAlign w:val="center"/>
+            <w:hideMark/>
+          </w:tcPr>
+          <w:p>
+            <w:r>
+              <w:t>Convert data types to match DW schema</w:t>
+            </w:r>
+          </w:p>
+        </w:tc>
+      </w:tr>
+      <w:tr>
+        <w:trPr>
+          <w:tblCellSpacing w:w="15" w:type="dxa"/>
+        </w:trPr>
+        <w:tc>
+          <w:tcPr>
+            <w:tcW w:w="0" w:type="auto"/>
+            <w:vAlign w:val="center"/>
+            <w:hideMark/>
+          </w:tcPr>
+          <w:p>
+            <w:r>
+              <w:rPr>
+                <w:b/>
+                <w:bCs/>
+              </w:rPr>
+              <w:t>Derived Column</w:t>
+            </w:r>
+          </w:p>
+        </w:tc>
+        <w:tc>
+          <w:tcPr>
+            <w:tcW w:w="0" w:type="auto"/>
+            <w:vAlign w:val="center"/>
+            <w:hideMark/>
+          </w:tcPr>
+          <w:p>
+            <w:r>
+              <w:t xml:space="preserve">Create calculated columns like </w:t>
+            </w:r>
+            <w:proofErr w:type="spellStart"/>
+            <w:r>
+              <w:t>Customer_FullName</w:t>
+            </w:r>
+            <w:proofErr w:type="spellEnd"/>
+          </w:p>
+        </w:tc>
+      </w:tr>
+      <w:tr>
+        <w:trPr>
+          <w:tblCellSpacing w:w="15" w:type="dxa"/>
+        </w:trPr>
+        <w:tc>
+          <w:tcPr>
+            <w:tcW w:w="0" w:type="auto"/>
+            <w:vAlign w:val="center"/>
+            <w:hideMark/>
+          </w:tcPr>
+          <w:p>
+            <w:r>
+              <w:rPr>
+                <w:b/>
+                <w:bCs/>
+              </w:rPr>
+              <w:t>Lookup</w:t>
+            </w:r>
+          </w:p>
+        </w:tc>
+        <w:tc>
+          <w:tcPr>
+            <w:tcW w:w="0" w:type="auto"/>
+            <w:vAlign w:val="center"/>
+            <w:hideMark/>
+          </w:tcPr>
+          <w:p>
+            <w:r>
+              <w:t>Link foreign keys from dimensions to fact table</w:t>
+            </w:r>
+          </w:p>
+        </w:tc>
+      </w:tr>
+      <w:tr>
+        <w:trPr>
+          <w:tblCellSpacing w:w="15" w:type="dxa"/>
+        </w:trPr>
+        <w:tc>
+          <w:tcPr>
+            <w:tcW w:w="0" w:type="auto"/>
+            <w:vAlign w:val="center"/>
+            <w:hideMark/>
+          </w:tcPr>
+          <w:p>
+            <w:r>
+              <w:rPr>
+                <w:b/>
+                <w:bCs/>
+              </w:rPr>
+              <w:t>Conditional Split</w:t>
+            </w:r>
+          </w:p>
+        </w:tc>
+        <w:tc>
+          <w:tcPr>
+            <w:tcW w:w="0" w:type="auto"/>
+            <w:vAlign w:val="center"/>
+            <w:hideMark/>
+          </w:tcPr>
+          <w:p>
+            <w:r>
+              <w:t>Filter invalid or missing data</w:t>
+            </w:r>
+          </w:p>
+        </w:tc>
+      </w:tr>
+      <w:tr>
+        <w:trPr>
+          <w:tblCellSpacing w:w="15" w:type="dxa"/>
+        </w:trPr>
+        <w:tc>
+          <w:tcPr>
+            <w:tcW w:w="0" w:type="auto"/>
+            <w:vAlign w:val="center"/>
+            <w:hideMark/>
+          </w:tcPr>
+          <w:p>
+            <w:r>
+              <w:rPr>
+                <w:b/>
+                <w:bCs/>
+              </w:rPr>
+              <w:t>Sort / Aggregate</w:t>
+            </w:r>
+          </w:p>
+        </w:tc>
+        <w:tc>
+          <w:tcPr>
+            <w:tcW w:w="0" w:type="auto"/>
+            <w:vAlign w:val="center"/>
+            <w:hideMark/>
+          </w:tcPr>
+          <w:p>
+            <w:r>
+              <w:t>Aggregate monthly usage per customer if required</w:t>
+            </w:r>
+          </w:p>
+        </w:tc>
+      </w:tr>
+    </w:tbl>
+    <w:p>
+      <w:r>
+        <w:pict w14:anchorId="2882E7BF">
+          <v:rect id="_x0000_i1708" style="width:0;height:1.5pt" o:hralign="center" o:hrstd="t" o:hr="t" fillcolor="#a0a0a0" stroked="f"/>
+        </w:pict>
+      </w:r>
+    </w:p>
+    <w:p>
+      <w:pPr>
+        <w:rPr>
+          <w:b/>
+          <w:bCs/>
+        </w:rPr>
+      </w:pPr>
+      <w:r>
+        <w:rPr>
+          <w:b/>
+          <w:bCs/>
+        </w:rPr>
+        <w:lastRenderedPageBreak/>
+        <w:t>5.4 Order of Execution</w:t>
+      </w:r>
+    </w:p>
+    <w:p>
+      <w:pPr>
+        <w:numPr>
+          <w:ilvl w:val="0"/>
+          <w:numId w:val="30"/>
+        </w:numPr>
+      </w:pPr>
+      <w:r>
+        <w:t xml:space="preserve">Load </w:t>
+      </w:r>
+      <w:proofErr w:type="spellStart"/>
+      <w:r>
+        <w:t>Dim_Date</w:t>
+      </w:r>
+      <w:proofErr w:type="spellEnd"/>
+    </w:p>
+    <w:p>
+      <w:pPr>
+        <w:numPr>
+          <w:ilvl w:val="0"/>
+          <w:numId w:val="30"/>
+        </w:numPr>
+      </w:pPr>
+      <w:r>
+        <w:t xml:space="preserve">Load </w:t>
+      </w:r>
+      <w:proofErr w:type="spellStart"/>
+      <w:r>
+        <w:t>Dim_Customer</w:t>
+      </w:r>
+      <w:proofErr w:type="spellEnd"/>
+    </w:p>
+    <w:p>
+      <w:pPr>
+        <w:numPr>
+          <w:ilvl w:val="0"/>
+          <w:numId w:val="30"/>
+        </w:numPr>
+      </w:pPr>
+      <w:r>
+        <w:t xml:space="preserve">Load </w:t>
+      </w:r>
+      <w:proofErr w:type="spellStart"/>
+      <w:r>
+        <w:t>Fact_ElectricityUsage</w:t>
+      </w:r>
+      <w:proofErr w:type="spellEnd"/>
+    </w:p>
+    <w:p>
+      <w:r>
+        <w:t>This order ensures all foreign key references are available for the fact table.</w:t>
+      </w:r>
+    </w:p>
+    <w:p>
+      <w:r>
+        <w:pict w14:anchorId="41014DE6">
+          <v:rect id="_x0000_i1709" style="width:0;height:1.5pt" o:hralign="center" o:hrstd="t" o:hr="t" fillcolor="#a0a0a0" stroked="f"/>
+        </w:pict>
+      </w:r>
+    </w:p>
+    <w:p>
+      <w:pPr>
+        <w:rPr>
+          <w:b/>
+          <w:bCs/>
+        </w:rPr>
+      </w:pPr>
+      <w:r>
+        <w:rPr>
+          <w:b/>
+          <w:bCs/>
+        </w:rPr>
+        <w:t>5.5 Validation Queries</w:t>
+      </w:r>
+    </w:p>
+    <w:p>
+      <w:r>
+        <w:t xml:space="preserve">-- Check record count in </w:t>
+      </w:r>
+      <w:proofErr w:type="spellStart"/>
+      <w:r>
+        <w:t>Dim_Customer</w:t>
+      </w:r>
+      <w:proofErr w:type="spellEnd"/>
+    </w:p>
+    <w:p>
+      <w:r>
+        <w:t xml:space="preserve">SELECT COUNT(*) FROM </w:t>
+      </w:r>
+      <w:proofErr w:type="spellStart"/>
+      <w:r>
+        <w:t>Dim_Customer</w:t>
+      </w:r>
+      <w:proofErr w:type="spellEnd"/>
+      <w:r>
+        <w:t>;</w:t>
+      </w:r>
+    </w:p>
+    <w:p/>
+    <w:p>
+      <w:r>
+        <w:t xml:space="preserve">-- Verify all fact table rows have valid </w:t>
+      </w:r>
+      <w:proofErr w:type="spellStart"/>
+      <w:r>
+        <w:t>Customer_ID</w:t>
+      </w:r>
+      <w:proofErr w:type="spellEnd"/>
+    </w:p>
+    <w:p>
+      <w:r>
+        <w:t>SELECT *</w:t>
+      </w:r>
+    </w:p>
+    <w:p>
+      <w:r>
+        <w:t xml:space="preserve">FROM </w:t>
+      </w:r>
+      <w:proofErr w:type="spellStart"/>
+      <w:r>
+        <w:t>Fact_ElectricityUsage</w:t>
+      </w:r>
+      <w:proofErr w:type="spellEnd"/>
+      <w:r>
+        <w:t xml:space="preserve"> f</w:t>
+      </w:r>
+    </w:p>
+    <w:p>
+      <w:r>
+        <w:t>WHERE NOT EXISTS (</w:t>
+      </w:r>
+    </w:p>
+    <w:p>
+      <w:r>
+        <w:t xml:space="preserve">    SELECT 1 FROM </w:t>
+      </w:r>
+      <w:proofErr w:type="spellStart"/>
+      <w:r>
+        <w:t>Dim_Customer</w:t>
+      </w:r>
+      <w:proofErr w:type="spellEnd"/>
+      <w:r>
+        <w:t xml:space="preserve"> c WHERE </w:t>
+      </w:r>
+      <w:proofErr w:type="spellStart"/>
+      <w:r>
+        <w:t>c.Customer_ID</w:t>
+      </w:r>
+      <w:proofErr w:type="spellEnd"/>
+      <w:r>
+        <w:t xml:space="preserve"> = </w:t>
+      </w:r>
+      <w:proofErr w:type="spellStart"/>
+      <w:r>
+        <w:t>f.Customer_ID</w:t>
+      </w:r>
+      <w:proofErr w:type="spellEnd"/>
+    </w:p>
+    <w:p>
+      <w:r>
+        <w:t>);</w:t>
+      </w:r>
+    </w:p>
+    <w:p>
+      <w:r>
+        <w:pict w14:anchorId="6A163D47">
+          <v:rect id="_x0000_i1710" style="width:0;height:1.5pt" o:hralign="center" o:hrstd="t" o:hr="t" fillcolor="#a0a0a0" stroked="f"/>
+        </w:pict>
+      </w:r>
+    </w:p>
+    <w:p>
+      <w:pPr>
+        <w:rPr>
+          <w:b/>
+          <w:bCs/>
+        </w:rPr>
+      </w:pPr>
+      <w:r>
+        <w:rPr>
+          <w:b/>
+          <w:bCs/>
+        </w:rPr>
+        <w:t>Task 6: Accumulating Fact Table Updates</w:t>
+      </w:r>
+    </w:p>
+    <w:p>
+      <w:r>
+        <w:rPr>
+          <w:b/>
+          <w:bCs/>
+        </w:rPr>
+        <w:t>Objective:</w:t>
+      </w:r>
+      <w:r>
+        <w:t xml:space="preserve"> Update the fact table to track transaction completion time and process duration.</w:t>
+      </w:r>
+    </w:p>
+    <w:p>
+      <w:r>
+        <w:pict w14:anchorId="7239CCFE">
+          <v:rect id="_x0000_i1711" style="width:0;height:1.5pt" o:hralign="center" o:hrstd="t" o:hr="t" fillcolor="#a0a0a0" stroked="f"/>
+        </w:pict>
+      </w:r>
+    </w:p>
+    <w:p>
+      <w:pPr>
+        <w:rPr>
+          <w:b/>
+          <w:bCs/>
+        </w:rPr>
+      </w:pPr>
+      <w:r>
+        <w:rPr>
+          <w:b/>
+          <w:bCs/>
+        </w:rPr>
+        <w:t>6.1 Schema Changes</w:t>
+      </w:r>
+    </w:p>
+    <w:p>
+      <w:r>
+        <w:rPr>
+          <w:b/>
+          <w:bCs/>
+        </w:rPr>
+        <w:t>Fact Table Columns Added:</w:t>
+      </w:r>
+    </w:p>
+    <w:p>
+      <w:pPr>
+        <w:numPr>
+          <w:ilvl w:val="0"/>
+          <w:numId w:val="31"/>
+        </w:numPr>
+      </w:pPr>
+      <w:proofErr w:type="spellStart"/>
+      <w:r>
+        <w:t>accm_txn_create_time</w:t>
+      </w:r>
+      <w:proofErr w:type="spellEnd"/>
+      <w:r>
+        <w:t xml:space="preserve"> → timestamp when record is created</w:t>
+      </w:r>
+    </w:p>
+    <w:p>
+      <w:pPr>
+        <w:numPr>
+          <w:ilvl w:val="0"/>
+          <w:numId w:val="31"/>
+        </w:numPr>
+      </w:pPr>
+      <w:proofErr w:type="spellStart"/>
+      <w:r>
+        <w:t>accm_txn_complete_time</w:t>
+      </w:r>
+      <w:proofErr w:type="spellEnd"/>
+      <w:r>
+        <w:t xml:space="preserve"> → timestamp when transaction is completed</w:t>
+      </w:r>
+    </w:p>
+    <w:p>
+      <w:pPr>
+        <w:numPr>
+          <w:ilvl w:val="0"/>
+          <w:numId w:val="31"/>
+        </w:numPr>
+      </w:pPr>
+      <w:proofErr w:type="spellStart"/>
+      <w:r>
+        <w:t>txn_process_time_hours</w:t>
+      </w:r>
+      <w:proofErr w:type="spellEnd"/>
+      <w:r>
+        <w:t xml:space="preserve"> → hours between creation and completion</w:t>
+      </w:r>
+    </w:p>
+    <w:p>
+      <w:r>
+        <w:rPr>
+          <w:b/>
+          <w:bCs/>
+        </w:rPr>
+        <w:lastRenderedPageBreak/>
+        <w:t>SQL Example:</w:t>
+      </w:r>
+    </w:p>
+    <w:p>
+      <w:r>
+        <w:t xml:space="preserve">ALTER TABLE </w:t>
+      </w:r>
+      <w:proofErr w:type="spellStart"/>
+      <w:r>
+        <w:t>Fact_ElectricityUsage</w:t>
+      </w:r>
+      <w:proofErr w:type="spellEnd"/>
+    </w:p>
+    <w:p>
+      <w:r>
+        <w:t xml:space="preserve">ADD </w:t>
+      </w:r>
+      <w:proofErr w:type="spellStart"/>
+      <w:r>
+        <w:t>accm_txn_create_time</w:t>
+      </w:r>
+      <w:proofErr w:type="spellEnd"/>
+      <w:r>
+        <w:t xml:space="preserve"> DATETIME DEFAULT GETDATE(),</w:t>
+      </w:r>
+    </w:p>
+    <w:p>
+      <w:r>
+        <w:t xml:space="preserve">    </w:t>
+      </w:r>
+      <w:proofErr w:type="spellStart"/>
+      <w:r>
+        <w:t>accm_txn_complete_time</w:t>
+      </w:r>
+      <w:proofErr w:type="spellEnd"/>
+      <w:r>
+        <w:t xml:space="preserve"> DATETIME NULL,</w:t>
+      </w:r>
+    </w:p>
+    <w:p>
+      <w:r>
+        <w:t xml:space="preserve">    </w:t>
+      </w:r>
+      <w:proofErr w:type="spellStart"/>
+      <w:r>
+        <w:t>txn_process_time_hours</w:t>
+      </w:r>
+      <w:proofErr w:type="spellEnd"/>
+      <w:r>
+        <w:t xml:space="preserve"> FLOAT NULL;</w:t>
+      </w:r>
+    </w:p>
+    <w:p>
+      <w:r>
+        <w:pict w14:anchorId="2E7A244F">
+          <v:rect id="_x0000_i1712" style="width:0;height:1.5pt" o:hralign="center" o:hrstd="t" o:hr="t" fillcolor="#a0a0a0" stroked="f"/>
+        </w:pict>
+      </w:r>
+    </w:p>
+    <w:p>
+      <w:pPr>
+        <w:rPr>
+          <w:b/>
+          <w:bCs/>
+        </w:rPr>
+      </w:pPr>
+      <w:r>
+        <w:rPr>
+          <w:b/>
+          <w:bCs/>
+        </w:rPr>
+        <w:t>6.2 ETL Package for Updating Completion Time</w:t>
+      </w:r>
+    </w:p>
+    <w:p>
+      <w:r>
+        <w:rPr>
+          <w:b/>
+          <w:bCs/>
+        </w:rPr>
+        <w:t>Package Name:</w:t>
+      </w:r>
+      <w:r>
+        <w:t xml:space="preserve"> </w:t>
+      </w:r>
+      <w:proofErr w:type="spellStart"/>
+      <w:r>
+        <w:t>ETL_Fact_Update.dtsx</w:t>
+      </w:r>
+      <w:proofErr w:type="spellEnd"/>
+    </w:p>
+    <w:p>
+      <w:r>
+        <w:rPr>
+          <w:b/>
+          <w:bCs/>
+        </w:rPr>
+        <w:t>Steps:</w:t>
+      </w:r>
+    </w:p>
+    <w:p>
+      <w:pPr>
+        <w:numPr>
+          <w:ilvl w:val="0"/>
+          <w:numId w:val="32"/>
+        </w:numPr>
+      </w:pPr>
+      <w:r>
+        <w:rPr>
+          <w:b/>
+          <w:bCs/>
+        </w:rPr>
+        <w:t>Source:</w:t>
+      </w:r>
+      <w:r>
+        <w:t xml:space="preserve"> CSV or SQL table containing </w:t>
+      </w:r>
+      <w:proofErr w:type="spellStart"/>
+      <w:r>
+        <w:t>Fact_Table_Natural_Key</w:t>
+      </w:r>
+      <w:proofErr w:type="spellEnd"/>
+      <w:r>
+        <w:t xml:space="preserve"> and </w:t>
+      </w:r>
+      <w:proofErr w:type="spellStart"/>
+      <w:r>
+        <w:t>accm_txn_complete_time</w:t>
+      </w:r>
+      <w:proofErr w:type="spellEnd"/>
+    </w:p>
+    <w:p>
+      <w:pPr>
+        <w:numPr>
+          <w:ilvl w:val="0"/>
+          <w:numId w:val="32"/>
+        </w:numPr>
+      </w:pPr>
+      <w:r>
+        <w:rPr>
+          <w:b/>
+          <w:bCs/>
+        </w:rPr>
+        <w:t>Lookup:</w:t>
+      </w:r>
+      <w:r>
+        <w:t xml:space="preserve"> Match </w:t>
+      </w:r>
+      <w:proofErr w:type="spellStart"/>
+      <w:r>
+        <w:t>txn_id</w:t>
+      </w:r>
+      <w:proofErr w:type="spellEnd"/>
+      <w:r>
+        <w:t xml:space="preserve"> to </w:t>
+      </w:r>
+      <w:proofErr w:type="spellStart"/>
+      <w:r>
+        <w:t>Fact_ElectricityUsage</w:t>
+      </w:r>
+      <w:proofErr w:type="spellEnd"/>
+    </w:p>
+    <w:p>
+      <w:pPr>
+        <w:numPr>
+          <w:ilvl w:val="0"/>
+          <w:numId w:val="32"/>
+        </w:numPr>
+      </w:pPr>
+      <w:r>
+        <w:rPr>
+          <w:b/>
+          <w:bCs/>
+        </w:rPr>
+        <w:t>Derived Column:</w:t>
+      </w:r>
+      <w:r>
+        <w:t xml:space="preserve"> Calculate </w:t>
+      </w:r>
+      <w:proofErr w:type="spellStart"/>
+      <w:r>
+        <w:t>txn_process_time_hours</w:t>
+      </w:r>
+      <w:proofErr w:type="spellEnd"/>
+    </w:p>
+    <w:p>
+      <w:pPr>
+        <w:numPr>
+          <w:ilvl w:val="0"/>
+          <w:numId w:val="32"/>
+        </w:numPr>
+        <w:tabs>
+          <w:tab w:val="clear" w:pos="720"/>
+        </w:tabs>
+      </w:pPr>
+      <w:r>
+        <w:t xml:space="preserve">DATEDIFF(HOUR, </w:t>
+      </w:r>
+      <w:proofErr w:type="spellStart"/>
+      <w:r>
+        <w:t>accm_txn_create_time</w:t>
+      </w:r>
+      <w:proofErr w:type="spellEnd"/>
+      <w:r>
+        <w:t xml:space="preserve">, </w:t>
+      </w:r>
+      <w:proofErr w:type="spellStart"/>
+      <w:r>
+        <w:t>accm_txn_complete_time</w:t>
+      </w:r>
+      <w:proofErr w:type="spellEnd"/>
+      <w:r>
+        <w:t>)</w:t>
+      </w:r>
+    </w:p>
+    <w:p>
+      <w:pPr>
+        <w:numPr>
+          <w:ilvl w:val="0"/>
+          <w:numId w:val="32"/>
+        </w:numPr>
+      </w:pPr>
+      <w:r>
+        <w:rPr>
+          <w:b/>
+          <w:bCs/>
+        </w:rPr>
+        <w:t>OLE DB Command:</w:t>
+      </w:r>
+      <w:r>
+        <w:t xml:space="preserve"> Update the fact table</w:t>
+      </w:r>
+    </w:p>
+    <w:p>
+      <w:r>
+        <w:rPr>
+          <w:b/>
+          <w:bCs/>
+        </w:rPr>
+        <w:t>SQL Stored Procedure Example:</w:t>
+      </w:r>
+    </w:p>
+    <w:p>
+      <w:r>
+        <w:t xml:space="preserve">CREATE PROCEDURE </w:t>
+      </w:r>
+      <w:proofErr w:type="spellStart"/>
+      <w:r>
+        <w:t>UpdateFactCompletion</w:t>
+      </w:r>
+      <w:proofErr w:type="spellEnd"/>
+    </w:p>
+    <w:p>
+      <w:r>
+        <w:t>AS</w:t>
+      </w:r>
+    </w:p>
+    <w:p>
+      <w:r>
+        <w:t>BEGIN</w:t>
+      </w:r>
+    </w:p>
+    <w:p>
+      <w:r>
+        <w:t xml:space="preserve">    UPDATE f</w:t>
+      </w:r>
+    </w:p>
+    <w:p>
+      <w:r>
+        <w:t xml:space="preserve">    SET </w:t>
+      </w:r>
+      <w:proofErr w:type="spellStart"/>
+      <w:r>
+        <w:t>accm_txn_complete_time</w:t>
+      </w:r>
+      <w:proofErr w:type="spellEnd"/>
+      <w:r>
+        <w:t xml:space="preserve"> = </w:t>
+      </w:r>
+      <w:proofErr w:type="spellStart"/>
+      <w:r>
+        <w:t>s.accm_txn_complete_time</w:t>
+      </w:r>
+      <w:proofErr w:type="spellEnd"/>
+      <w:r>
+        <w:t>,</w:t>
+      </w:r>
+    </w:p>
+    <w:p>
+      <w:r>
+        <w:t xml:space="preserve">        </w:t>
+      </w:r>
+      <w:proofErr w:type="spellStart"/>
+      <w:r>
+        <w:t>txn_process_time_hours</w:t>
+      </w:r>
+      <w:proofErr w:type="spellEnd"/>
+      <w:r>
+        <w:t xml:space="preserve"> = DATEDIFF(HOUR, </w:t>
+      </w:r>
+      <w:proofErr w:type="spellStart"/>
+      <w:r>
+        <w:t>f.accm_txn_create_time</w:t>
+      </w:r>
+      <w:proofErr w:type="spellEnd"/>
+      <w:r>
+        <w:t xml:space="preserve">, </w:t>
+      </w:r>
+      <w:proofErr w:type="spellStart"/>
+      <w:r>
+        <w:t>s.accm_txn_complete_time</w:t>
+      </w:r>
+      <w:proofErr w:type="spellEnd"/>
+      <w:r>
+        <w:t>)</w:t>
+      </w:r>
+    </w:p>
+    <w:p>
+      <w:r>
+        <w:t xml:space="preserve">    FROM </w:t>
+      </w:r>
+      <w:proofErr w:type="spellStart"/>
+      <w:r>
+        <w:t>Fact_ElectricityUsage</w:t>
+      </w:r>
+      <w:proofErr w:type="spellEnd"/>
+      <w:r>
+        <w:t xml:space="preserve"> f</w:t>
+      </w:r>
+    </w:p>
+    <w:p>
+      <w:r>
+        <w:t xml:space="preserve">    INNER JOIN </w:t>
+      </w:r>
+      <w:proofErr w:type="spellStart"/>
+      <w:r>
+        <w:t>Staging_FactUpdate</w:t>
+      </w:r>
+      <w:proofErr w:type="spellEnd"/>
+      <w:r>
+        <w:t xml:space="preserve"> s</w:t>
+      </w:r>
+    </w:p>
+    <w:p>
+      <w:r>
+        <w:t xml:space="preserve">    ON </w:t>
+      </w:r>
+      <w:proofErr w:type="spellStart"/>
+      <w:r>
+        <w:t>f.txn_id</w:t>
+      </w:r>
+      <w:proofErr w:type="spellEnd"/>
+      <w:r>
+        <w:t xml:space="preserve"> = </w:t>
+      </w:r>
+      <w:proofErr w:type="spellStart"/>
+      <w:r>
+        <w:t>s.txn_id</w:t>
+      </w:r>
+      <w:proofErr w:type="spellEnd"/>
+      <w:r>
+        <w:t>;</w:t>
+      </w:r>
+    </w:p>
+    <w:p>
+      <w:r>
+        <w:t>END;</w:t>
+      </w:r>
+    </w:p>
+    <w:p>
+      <w:r>
+        <w:rPr>
+          <w:b/>
+          <w:bCs/>
+        </w:rPr>
+        <w:lastRenderedPageBreak/>
+        <w:t>Screenshot Placeholder:</w:t>
+      </w:r>
+      <w:r>
+        <w:t xml:space="preserve"> Insert Fact Update Data Flow Screenshot Here</w:t>
+      </w:r>
+    </w:p>
+    <w:p>
+      <w:r>
+        <w:pict w14:anchorId="1ECFC43E">
+          <v:rect id="_x0000_i1713" style="width:0;height:1.5pt" o:hralign="center" o:hrstd="t" o:hr="t" fillcolor="#a0a0a0" stroked="f"/>
+        </w:pict>
+      </w:r>
+    </w:p>
+    <w:p>
+      <w:pPr>
+        <w:rPr>
+          <w:b/>
+          <w:bCs/>
+        </w:rPr>
+      </w:pPr>
+      <w:r>
+        <w:rPr>
+          <w:b/>
+          <w:bCs/>
+        </w:rPr>
+        <w:t>6.3 Validation Queries for Accumulating Facts</w:t>
+      </w:r>
+    </w:p>
+    <w:p>
+      <w:r>
+        <w:t>-- Verify process hours are calculated</w:t>
+      </w:r>
+    </w:p>
+    <w:p>
+      <w:r>
+        <w:t xml:space="preserve">SELECT </w:t>
+      </w:r>
+      <w:proofErr w:type="spellStart"/>
+      <w:r>
+        <w:t>txn_id</w:t>
+      </w:r>
+      <w:proofErr w:type="spellEnd"/>
+      <w:r>
+        <w:t xml:space="preserve">, </w:t>
+      </w:r>
+      <w:proofErr w:type="spellStart"/>
+      <w:r>
+        <w:t>accm_txn_create_time</w:t>
+      </w:r>
+      <w:proofErr w:type="spellEnd"/>
+      <w:r>
+        <w:t xml:space="preserve">, </w:t>
+      </w:r>
+      <w:proofErr w:type="spellStart"/>
+      <w:r>
+        <w:t>accm_txn_complete_time</w:t>
+      </w:r>
+      <w:proofErr w:type="spellEnd"/>
+      <w:r>
+        <w:t xml:space="preserve">, </w:t>
+      </w:r>
+      <w:proofErr w:type="spellStart"/>
+      <w:r>
+        <w:t>txn_process_time_hours</w:t>
+      </w:r>
+      <w:proofErr w:type="spellEnd"/>
+    </w:p>
+    <w:p>
+      <w:r>
+        <w:t xml:space="preserve">FROM </w:t>
+      </w:r>
+      <w:proofErr w:type="spellStart"/>
+      <w:r>
+        <w:t>Fact_ElectricityUsage</w:t>
+      </w:r>
+      <w:proofErr w:type="spellEnd"/>
+    </w:p>
+    <w:p>
+      <w:r>
+        <w:t xml:space="preserve">WHERE </w:t>
+      </w:r>
+      <w:proofErr w:type="spellStart"/>
+      <w:r>
+        <w:t>accm_txn_complete_time</w:t>
+      </w:r>
+      <w:proofErr w:type="spellEnd"/>
+      <w:r>
+        <w:t xml:space="preserve"> IS NOT NULL;</w:t>
+      </w:r>
+    </w:p>
+    <w:p/>
+    <w:p>
+      <w:r>
+        <w:t>-- Check for missing completion times</w:t>
+      </w:r>
+    </w:p>
+    <w:p>
+      <w:r>
+        <w:t>SELECT *</w:t>
+      </w:r>
+    </w:p>
+    <w:p>
+      <w:r>
+        <w:t xml:space="preserve">FROM </w:t>
+      </w:r>
+      <w:proofErr w:type="spellStart"/>
+      <w:r>
+        <w:t>Fact_ElectricityUsage</w:t>
+      </w:r>
+      <w:proofErr w:type="spellEnd"/>
+    </w:p>
+    <w:p>
+      <w:r>
+        <w:t xml:space="preserve">WHERE </w:t>
+      </w:r>
+      <w:proofErr w:type="spellStart"/>
+      <w:r>
+        <w:t>accm_txn_complete_time</w:t>
+      </w:r>
+      <w:proofErr w:type="spellEnd"/>
+      <w:r>
+        <w:t xml:space="preserve"> IS NULL;</w:t>
+      </w:r>
+    </w:p>
+    <w:p>
+      <w:r>
+        <w:pict w14:anchorId="23A83453">
+          <v:rect id="_x0000_i1714" style="width:0;height:1.5pt" o:hralign="center" o:hrstd="t" o:hr="t" fillcolor="#a0a0a0" stroked="f"/>
+        </w:pict>
+      </w:r>
+    </w:p>
+    <w:p>
+      <w:pPr>
+        <w:rPr>
+          <w:b/>
+          <w:bCs/>
+        </w:rPr>
+      </w:pPr>
+      <w:r>
+        <w:rPr>
+          <w:b/>
+          <w:bCs/>
+        </w:rPr>
+        <w:t>6.4 Summary</w:t>
+      </w:r>
+    </w:p>
+    <w:p>
+      <w:pPr>
+        <w:numPr>
+          <w:ilvl w:val="0"/>
+          <w:numId w:val="33"/>
+        </w:numPr>
+      </w:pPr>
+      <w:r>
+        <w:t>Successfully loaded dimensions and fact table using SSIS</w:t>
+      </w:r>
+    </w:p>
+    <w:p>
+      <w:pPr>
+        <w:numPr>
+          <w:ilvl w:val="0"/>
+          <w:numId w:val="33"/>
+        </w:numPr>
+      </w:pPr>
+      <w:r>
+        <w:t>Updated accumulating fact table with transaction completion time and calculated processing hours</w:t>
+      </w:r>
+    </w:p>
+    <w:p>
+      <w:pPr>
+        <w:numPr>
+          <w:ilvl w:val="0"/>
+          <w:numId w:val="33"/>
+        </w:numPr>
+      </w:pPr>
+      <w:r>
+        <w:t>Implemented lookups, derived columns, and validation to ensure DW integrity</w:t>
+      </w:r>
+    </w:p>
+    <w:p>
+      <w:r>
+        <w:rPr>
+          <w:b/>
+          <w:bCs/>
+        </w:rPr>
+        <w:t>All screenshots of ETL control flows, data flows, and validation results should be inserted in the placeholders above.</w:t>
+      </w:r>
+    </w:p>
+    <w:p>
+      <w:r>
+        <w:pict w14:anchorId="06EC17AB">
+          <v:rect id="_x0000_i1715" style="width:0;height:1.5pt" o:hralign="center" o:hrstd="t" o:hr="t" fillcolor="#a0a0a0" stroked="f"/>
+        </w:pict>
+      </w:r>
+    </w:p>
+    <w:p>
+      <w:r>
+        <w:t xml:space="preserve">I can also prepare a </w:t>
+      </w:r>
+      <w:r>
+        <w:rPr>
+          <w:b/>
+          <w:bCs/>
+        </w:rPr>
+        <w:t>fully formatted Word/Google Docs version</w:t>
+      </w:r>
+      <w:r>
+        <w:t xml:space="preserve"> with headings, tables, and screenshot placeholders if you want, so it’s ready to submit.</w:t>
+      </w:r>
+    </w:p>
+    <w:p>
+      <w:r>
+        <w:t>Do you want me to do that next?</w:t>
       </w:r>
     </w:p>
     <w:p/>
@@ -10375,6 +11930,127 @@
     </w:lvl>
   </w:abstractNum>
   <w:abstractNum w:abstractNumId="3" w15:restartNumberingAfterBreak="0">
+    <w:nsid w:val="0CC16816"/>
+    <w:multiLevelType w:val="multilevel"/>
+    <w:tmpl w:val="D0504D9C"/>
+    <w:lvl w:ilvl="0">
+      <w:start w:val="1"/>
+      <w:numFmt w:val="decimal"/>
+      <w:lvlText w:val="%1."/>
+      <w:lvlJc w:val="left"/>
+      <w:pPr>
+        <w:tabs>
+          <w:tab w:val="num" w:pos="720"/>
+        </w:tabs>
+        <w:ind w:left="720" w:hanging="360"/>
+      </w:pPr>
+    </w:lvl>
+    <w:lvl w:ilvl="1">
+      <w:start w:val="1"/>
+      <w:numFmt w:val="bullet"/>
+      <w:lvlText w:val="o"/>
+      <w:lvlJc w:val="left"/>
+      <w:pPr>
+        <w:tabs>
+          <w:tab w:val="num" w:pos="1440"/>
+        </w:tabs>
+        <w:ind w:left="1440" w:hanging="360"/>
+      </w:pPr>
+      <w:rPr>
+        <w:rFonts w:ascii="Courier New" w:hAnsi="Courier New" w:hint="default"/>
+        <w:sz w:val="20"/>
+      </w:rPr>
+    </w:lvl>
+    <w:lvl w:ilvl="2">
+      <w:start w:val="1"/>
+      <w:numFmt w:val="bullet"/>
+      <w:lvlText w:val=""/>
+      <w:lvlJc w:val="left"/>
+      <w:pPr>
+        <w:tabs>
+          <w:tab w:val="num" w:pos="2160"/>
+        </w:tabs>
+        <w:ind w:left="2160" w:hanging="360"/>
+      </w:pPr>
+      <w:rPr>
+        <w:rFonts w:ascii="Wingdings" w:hAnsi="Wingdings" w:hint="default"/>
+        <w:sz w:val="20"/>
+      </w:rPr>
+    </w:lvl>
+    <w:lvl w:ilvl="3" w:tentative="1">
+      <w:start w:val="1"/>
+      <w:numFmt w:val="decimal"/>
+      <w:lvlText w:val="%4."/>
+      <w:lvlJc w:val="left"/>
+      <w:pPr>
+        <w:tabs>
+          <w:tab w:val="num" w:pos="2880"/>
+        </w:tabs>
+        <w:ind w:left="2880" w:hanging="360"/>
+      </w:pPr>
+    </w:lvl>
+    <w:lvl w:ilvl="4" w:tentative="1">
+      <w:start w:val="1"/>
+      <w:numFmt w:val="decimal"/>
+      <w:lvlText w:val="%5."/>
+      <w:lvlJc w:val="left"/>
+      <w:pPr>
+        <w:tabs>
+          <w:tab w:val="num" w:pos="3600"/>
+        </w:tabs>
+        <w:ind w:left="3600" w:hanging="360"/>
+      </w:pPr>
+    </w:lvl>
+    <w:lvl w:ilvl="5" w:tentative="1">
+      <w:start w:val="1"/>
+      <w:numFmt w:val="decimal"/>
+      <w:lvlText w:val="%6."/>
+      <w:lvlJc w:val="left"/>
+      <w:pPr>
+        <w:tabs>
+          <w:tab w:val="num" w:pos="4320"/>
+        </w:tabs>
+        <w:ind w:left="4320" w:hanging="360"/>
+      </w:pPr>
+    </w:lvl>
+    <w:lvl w:ilvl="6" w:tentative="1">
+      <w:start w:val="1"/>
+      <w:numFmt w:val="decimal"/>
+      <w:lvlText w:val="%7."/>
+      <w:lvlJc w:val="left"/>
+      <w:pPr>
+        <w:tabs>
+          <w:tab w:val="num" w:pos="5040"/>
+        </w:tabs>
+        <w:ind w:left="5040" w:hanging="360"/>
+      </w:pPr>
+    </w:lvl>
+    <w:lvl w:ilvl="7" w:tentative="1">
+      <w:start w:val="1"/>
+      <w:numFmt w:val="decimal"/>
+      <w:lvlText w:val="%8."/>
+      <w:lvlJc w:val="left"/>
+      <w:pPr>
+        <w:tabs>
+          <w:tab w:val="num" w:pos="5760"/>
+        </w:tabs>
+        <w:ind w:left="5760" w:hanging="360"/>
+      </w:pPr>
+    </w:lvl>
+    <w:lvl w:ilvl="8" w:tentative="1">
+      <w:start w:val="1"/>
+      <w:numFmt w:val="decimal"/>
+      <w:lvlText w:val="%9."/>
+      <w:lvlJc w:val="left"/>
+      <w:pPr>
+        <w:tabs>
+          <w:tab w:val="num" w:pos="6480"/>
+        </w:tabs>
+        <w:ind w:left="6480" w:hanging="360"/>
+      </w:pPr>
+    </w:lvl>
+  </w:abstractNum>
+  <w:abstractNum w:abstractNumId="4" w15:restartNumberingAfterBreak="0">
     <w:nsid w:val="0F097B2F"/>
     <w:multiLevelType w:val="multilevel"/>
     <w:tmpl w:val="2A50BBCC"/>
@@ -10523,7 +12199,7 @@
       </w:rPr>
     </w:lvl>
   </w:abstractNum>
-  <w:abstractNum w:abstractNumId="4" w15:restartNumberingAfterBreak="0">
+  <w:abstractNum w:abstractNumId="5" w15:restartNumberingAfterBreak="0">
     <w:nsid w:val="1C080F26"/>
     <w:multiLevelType w:val="multilevel"/>
     <w:tmpl w:val="C254909E"/>
@@ -10672,7 +12348,120 @@
       </w:rPr>
     </w:lvl>
   </w:abstractNum>
-  <w:abstractNum w:abstractNumId="5" w15:restartNumberingAfterBreak="0">
+  <w:abstractNum w:abstractNumId="6" w15:restartNumberingAfterBreak="0">
+    <w:nsid w:val="1C4709D1"/>
+    <w:multiLevelType w:val="multilevel"/>
+    <w:tmpl w:val="947CED70"/>
+    <w:lvl w:ilvl="0">
+      <w:start w:val="1"/>
+      <w:numFmt w:val="decimal"/>
+      <w:lvlText w:val="%1."/>
+      <w:lvlJc w:val="left"/>
+      <w:pPr>
+        <w:tabs>
+          <w:tab w:val="num" w:pos="720"/>
+        </w:tabs>
+        <w:ind w:left="720" w:hanging="360"/>
+      </w:pPr>
+    </w:lvl>
+    <w:lvl w:ilvl="1" w:tentative="1">
+      <w:start w:val="1"/>
+      <w:numFmt w:val="decimal"/>
+      <w:lvlText w:val="%2."/>
+      <w:lvlJc w:val="left"/>
+      <w:pPr>
+        <w:tabs>
+          <w:tab w:val="num" w:pos="1440"/>
+        </w:tabs>
+        <w:ind w:left="1440" w:hanging="360"/>
+      </w:pPr>
+    </w:lvl>
+    <w:lvl w:ilvl="2" w:tentative="1">
+      <w:start w:val="1"/>
+      <w:numFmt w:val="decimal"/>
+      <w:lvlText w:val="%3."/>
+      <w:lvlJc w:val="left"/>
+      <w:pPr>
+        <w:tabs>
+          <w:tab w:val="num" w:pos="2160"/>
+        </w:tabs>
+        <w:ind w:left="2160" w:hanging="360"/>
+      </w:pPr>
+    </w:lvl>
+    <w:lvl w:ilvl="3" w:tentative="1">
+      <w:start w:val="1"/>
+      <w:numFmt w:val="decimal"/>
+      <w:lvlText w:val="%4."/>
+      <w:lvlJc w:val="left"/>
+      <w:pPr>
+        <w:tabs>
+          <w:tab w:val="num" w:pos="2880"/>
+        </w:tabs>
+        <w:ind w:left="2880" w:hanging="360"/>
+      </w:pPr>
+    </w:lvl>
+    <w:lvl w:ilvl="4" w:tentative="1">
+      <w:start w:val="1"/>
+      <w:numFmt w:val="decimal"/>
+      <w:lvlText w:val="%5."/>
+      <w:lvlJc w:val="left"/>
+      <w:pPr>
+        <w:tabs>
+          <w:tab w:val="num" w:pos="3600"/>
+        </w:tabs>
+        <w:ind w:left="3600" w:hanging="360"/>
+      </w:pPr>
+    </w:lvl>
+    <w:lvl w:ilvl="5" w:tentative="1">
+      <w:start w:val="1"/>
+      <w:numFmt w:val="decimal"/>
+      <w:lvlText w:val="%6."/>
+      <w:lvlJc w:val="left"/>
+      <w:pPr>
+        <w:tabs>
+          <w:tab w:val="num" w:pos="4320"/>
+        </w:tabs>
+        <w:ind w:left="4320" w:hanging="360"/>
+      </w:pPr>
+    </w:lvl>
+    <w:lvl w:ilvl="6" w:tentative="1">
+      <w:start w:val="1"/>
+      <w:numFmt w:val="decimal"/>
+      <w:lvlText w:val="%7."/>
+      <w:lvlJc w:val="left"/>
+      <w:pPr>
+        <w:tabs>
+          <w:tab w:val="num" w:pos="5040"/>
+        </w:tabs>
+        <w:ind w:left="5040" w:hanging="360"/>
+      </w:pPr>
+    </w:lvl>
+    <w:lvl w:ilvl="7" w:tentative="1">
+      <w:start w:val="1"/>
+      <w:numFmt w:val="decimal"/>
+      <w:lvlText w:val="%8."/>
+      <w:lvlJc w:val="left"/>
+      <w:pPr>
+        <w:tabs>
+          <w:tab w:val="num" w:pos="5760"/>
+        </w:tabs>
+        <w:ind w:left="5760" w:hanging="360"/>
+      </w:pPr>
+    </w:lvl>
+    <w:lvl w:ilvl="8" w:tentative="1">
+      <w:start w:val="1"/>
+      <w:numFmt w:val="decimal"/>
+      <w:lvlText w:val="%9."/>
+      <w:lvlJc w:val="left"/>
+      <w:pPr>
+        <w:tabs>
+          <w:tab w:val="num" w:pos="6480"/>
+        </w:tabs>
+        <w:ind w:left="6480" w:hanging="360"/>
+      </w:pPr>
+    </w:lvl>
+  </w:abstractNum>
+  <w:abstractNum w:abstractNumId="7" w15:restartNumberingAfterBreak="0">
     <w:nsid w:val="1FCB6C65"/>
     <w:multiLevelType w:val="multilevel"/>
     <w:tmpl w:val="3D5AF39E"/>
@@ -10821,7 +12610,7 @@
       </w:rPr>
     </w:lvl>
   </w:abstractNum>
-  <w:abstractNum w:abstractNumId="6" w15:restartNumberingAfterBreak="0">
+  <w:abstractNum w:abstractNumId="8" w15:restartNumberingAfterBreak="0">
     <w:nsid w:val="231B0BAC"/>
     <w:multiLevelType w:val="multilevel"/>
     <w:tmpl w:val="E8A6B4AA"/>
@@ -10970,7 +12759,156 @@
       </w:rPr>
     </w:lvl>
   </w:abstractNum>
-  <w:abstractNum w:abstractNumId="7" w15:restartNumberingAfterBreak="0">
+  <w:abstractNum w:abstractNumId="9" w15:restartNumberingAfterBreak="0">
+    <w:nsid w:val="23977FC0"/>
+    <w:multiLevelType w:val="multilevel"/>
+    <w:tmpl w:val="9814A064"/>
+    <w:lvl w:ilvl="0">
+      <w:start w:val="1"/>
+      <w:numFmt w:val="bullet"/>
+      <w:lvlText w:val=""/>
+      <w:lvlJc w:val="left"/>
+      <w:pPr>
+        <w:tabs>
+          <w:tab w:val="num" w:pos="720"/>
+        </w:tabs>
+        <w:ind w:left="720" w:hanging="360"/>
+      </w:pPr>
+      <w:rPr>
+        <w:rFonts w:ascii="Symbol" w:hAnsi="Symbol" w:hint="default"/>
+        <w:sz w:val="20"/>
+      </w:rPr>
+    </w:lvl>
+    <w:lvl w:ilvl="1" w:tentative="1">
+      <w:start w:val="1"/>
+      <w:numFmt w:val="bullet"/>
+      <w:lvlText w:val="o"/>
+      <w:lvlJc w:val="left"/>
+      <w:pPr>
+        <w:tabs>
+          <w:tab w:val="num" w:pos="1440"/>
+        </w:tabs>
+        <w:ind w:left="1440" w:hanging="360"/>
+      </w:pPr>
+      <w:rPr>
+        <w:rFonts w:ascii="Courier New" w:hAnsi="Courier New" w:hint="default"/>
+        <w:sz w:val="20"/>
+      </w:rPr>
+    </w:lvl>
+    <w:lvl w:ilvl="2" w:tentative="1">
+      <w:start w:val="1"/>
+      <w:numFmt w:val="bullet"/>
+      <w:lvlText w:val=""/>
+      <w:lvlJc w:val="left"/>
+      <w:pPr>
+        <w:tabs>
+          <w:tab w:val="num" w:pos="2160"/>
+        </w:tabs>
+        <w:ind w:left="2160" w:hanging="360"/>
+      </w:pPr>
+      <w:rPr>
+        <w:rFonts w:ascii="Wingdings" w:hAnsi="Wingdings" w:hint="default"/>
+        <w:sz w:val="20"/>
+      </w:rPr>
+    </w:lvl>
+    <w:lvl w:ilvl="3" w:tentative="1">
+      <w:start w:val="1"/>
+      <w:numFmt w:val="bullet"/>
+      <w:lvlText w:val=""/>
+      <w:lvlJc w:val="left"/>
+      <w:pPr>
+        <w:tabs>
+          <w:tab w:val="num" w:pos="2880"/>
+        </w:tabs>
+        <w:ind w:left="2880" w:hanging="360"/>
+      </w:pPr>
+      <w:rPr>
+        <w:rFonts w:ascii="Wingdings" w:hAnsi="Wingdings" w:hint="default"/>
+        <w:sz w:val="20"/>
+      </w:rPr>
+    </w:lvl>
+    <w:lvl w:ilvl="4" w:tentative="1">
+      <w:start w:val="1"/>
+      <w:numFmt w:val="bullet"/>
+      <w:lvlText w:val=""/>
+      <w:lvlJc w:val="left"/>
+      <w:pPr>
+        <w:tabs>
+          <w:tab w:val="num" w:pos="3600"/>
+        </w:tabs>
+        <w:ind w:left="3600" w:hanging="360"/>
+      </w:pPr>
+      <w:rPr>
+        <w:rFonts w:ascii="Wingdings" w:hAnsi="Wingdings" w:hint="default"/>
+        <w:sz w:val="20"/>
+      </w:rPr>
+    </w:lvl>
+    <w:lvl w:ilvl="5" w:tentative="1">
+      <w:start w:val="1"/>
+      <w:numFmt w:val="bullet"/>
+      <w:lvlText w:val=""/>
+      <w:lvlJc w:val="left"/>
+      <w:pPr>
+        <w:tabs>
+          <w:tab w:val="num" w:pos="4320"/>
+        </w:tabs>
+        <w:ind w:left="4320" w:hanging="360"/>
+      </w:pPr>
+      <w:rPr>
+        <w:rFonts w:ascii="Wingdings" w:hAnsi="Wingdings" w:hint="default"/>
+        <w:sz w:val="20"/>
+      </w:rPr>
+    </w:lvl>
+    <w:lvl w:ilvl="6" w:tentative="1">
+      <w:start w:val="1"/>
+      <w:numFmt w:val="bullet"/>
+      <w:lvlText w:val=""/>
+      <w:lvlJc w:val="left"/>
+      <w:pPr>
+        <w:tabs>
+          <w:tab w:val="num" w:pos="5040"/>
+        </w:tabs>
+        <w:ind w:left="5040" w:hanging="360"/>
+      </w:pPr>
+      <w:rPr>
+        <w:rFonts w:ascii="Wingdings" w:hAnsi="Wingdings" w:hint="default"/>
+        <w:sz w:val="20"/>
+      </w:rPr>
+    </w:lvl>
+    <w:lvl w:ilvl="7" w:tentative="1">
+      <w:start w:val="1"/>
+      <w:numFmt w:val="bullet"/>
+      <w:lvlText w:val=""/>
+      <w:lvlJc w:val="left"/>
+      <w:pPr>
+        <w:tabs>
+          <w:tab w:val="num" w:pos="5760"/>
+        </w:tabs>
+        <w:ind w:left="5760" w:hanging="360"/>
+      </w:pPr>
+      <w:rPr>
+        <w:rFonts w:ascii="Wingdings" w:hAnsi="Wingdings" w:hint="default"/>
+        <w:sz w:val="20"/>
+      </w:rPr>
+    </w:lvl>
+    <w:lvl w:ilvl="8" w:tentative="1">
+      <w:start w:val="1"/>
+      <w:numFmt w:val="bullet"/>
+      <w:lvlText w:val=""/>
+      <w:lvlJc w:val="left"/>
+      <w:pPr>
+        <w:tabs>
+          <w:tab w:val="num" w:pos="6480"/>
+        </w:tabs>
+        <w:ind w:left="6480" w:hanging="360"/>
+      </w:pPr>
+      <w:rPr>
+        <w:rFonts w:ascii="Wingdings" w:hAnsi="Wingdings" w:hint="default"/>
+        <w:sz w:val="20"/>
+      </w:rPr>
+    </w:lvl>
+  </w:abstractNum>
+  <w:abstractNum w:abstractNumId="10" w15:restartNumberingAfterBreak="0">
     <w:nsid w:val="25061186"/>
     <w:multiLevelType w:val="multilevel"/>
     <w:tmpl w:val="E7F68DCA"/>
@@ -11083,7 +13021,7 @@
       </w:pPr>
     </w:lvl>
   </w:abstractNum>
-  <w:abstractNum w:abstractNumId="8" w15:restartNumberingAfterBreak="0">
+  <w:abstractNum w:abstractNumId="11" w15:restartNumberingAfterBreak="0">
     <w:nsid w:val="2765033C"/>
     <w:multiLevelType w:val="multilevel"/>
     <w:tmpl w:val="7682CABC"/>
@@ -11232,7 +13170,7 @@
       </w:rPr>
     </w:lvl>
   </w:abstractNum>
-  <w:abstractNum w:abstractNumId="9" w15:restartNumberingAfterBreak="0">
+  <w:abstractNum w:abstractNumId="12" w15:restartNumberingAfterBreak="0">
     <w:nsid w:val="27CC04C5"/>
     <w:multiLevelType w:val="multilevel"/>
     <w:tmpl w:val="5FA82AF4"/>
@@ -11381,7 +13319,7 @@
       </w:rPr>
     </w:lvl>
   </w:abstractNum>
-  <w:abstractNum w:abstractNumId="10" w15:restartNumberingAfterBreak="0">
+  <w:abstractNum w:abstractNumId="13" w15:restartNumberingAfterBreak="0">
     <w:nsid w:val="2CB726AB"/>
     <w:multiLevelType w:val="multilevel"/>
     <w:tmpl w:val="583C75C0"/>
@@ -11530,7 +13468,7 @@
       </w:rPr>
     </w:lvl>
   </w:abstractNum>
-  <w:abstractNum w:abstractNumId="11" w15:restartNumberingAfterBreak="0">
+  <w:abstractNum w:abstractNumId="14" w15:restartNumberingAfterBreak="0">
     <w:nsid w:val="2D8633CB"/>
     <w:multiLevelType w:val="multilevel"/>
     <w:tmpl w:val="70C6EE08"/>
@@ -11643,7 +13581,120 @@
       </w:pPr>
     </w:lvl>
   </w:abstractNum>
-  <w:abstractNum w:abstractNumId="12" w15:restartNumberingAfterBreak="0">
+  <w:abstractNum w:abstractNumId="15" w15:restartNumberingAfterBreak="0">
+    <w:nsid w:val="2E86764A"/>
+    <w:multiLevelType w:val="multilevel"/>
+    <w:tmpl w:val="A3A8D5E4"/>
+    <w:lvl w:ilvl="0">
+      <w:start w:val="1"/>
+      <w:numFmt w:val="decimal"/>
+      <w:lvlText w:val="%1."/>
+      <w:lvlJc w:val="left"/>
+      <w:pPr>
+        <w:tabs>
+          <w:tab w:val="num" w:pos="720"/>
+        </w:tabs>
+        <w:ind w:left="720" w:hanging="360"/>
+      </w:pPr>
+    </w:lvl>
+    <w:lvl w:ilvl="1" w:tentative="1">
+      <w:start w:val="1"/>
+      <w:numFmt w:val="decimal"/>
+      <w:lvlText w:val="%2."/>
+      <w:lvlJc w:val="left"/>
+      <w:pPr>
+        <w:tabs>
+          <w:tab w:val="num" w:pos="1440"/>
+        </w:tabs>
+        <w:ind w:left="1440" w:hanging="360"/>
+      </w:pPr>
+    </w:lvl>
+    <w:lvl w:ilvl="2" w:tentative="1">
+      <w:start w:val="1"/>
+      <w:numFmt w:val="decimal"/>
+      <w:lvlText w:val="%3."/>
+      <w:lvlJc w:val="left"/>
+      <w:pPr>
+        <w:tabs>
+          <w:tab w:val="num" w:pos="2160"/>
+        </w:tabs>
+        <w:ind w:left="2160" w:hanging="360"/>
+      </w:pPr>
+    </w:lvl>
+    <w:lvl w:ilvl="3" w:tentative="1">
+      <w:start w:val="1"/>
+      <w:numFmt w:val="decimal"/>
+      <w:lvlText w:val="%4."/>
+      <w:lvlJc w:val="left"/>
+      <w:pPr>
+        <w:tabs>
+          <w:tab w:val="num" w:pos="2880"/>
+        </w:tabs>
+        <w:ind w:left="2880" w:hanging="360"/>
+      </w:pPr>
+    </w:lvl>
+    <w:lvl w:ilvl="4" w:tentative="1">
+      <w:start w:val="1"/>
+      <w:numFmt w:val="decimal"/>
+      <w:lvlText w:val="%5."/>
+      <w:lvlJc w:val="left"/>
+      <w:pPr>
+        <w:tabs>
+          <w:tab w:val="num" w:pos="3600"/>
+        </w:tabs>
+        <w:ind w:left="3600" w:hanging="360"/>
+      </w:pPr>
+    </w:lvl>
+    <w:lvl w:ilvl="5" w:tentative="1">
+      <w:start w:val="1"/>
+      <w:numFmt w:val="decimal"/>
+      <w:lvlText w:val="%6."/>
+      <w:lvlJc w:val="left"/>
+      <w:pPr>
+        <w:tabs>
+          <w:tab w:val="num" w:pos="4320"/>
+        </w:tabs>
+        <w:ind w:left="4320" w:hanging="360"/>
+      </w:pPr>
+    </w:lvl>
+    <w:lvl w:ilvl="6" w:tentative="1">
+      <w:start w:val="1"/>
+      <w:numFmt w:val="decimal"/>
+      <w:lvlText w:val="%7."/>
+      <w:lvlJc w:val="left"/>
+      <w:pPr>
+        <w:tabs>
+          <w:tab w:val="num" w:pos="5040"/>
+        </w:tabs>
+        <w:ind w:left="5040" w:hanging="360"/>
+      </w:pPr>
+    </w:lvl>
+    <w:lvl w:ilvl="7" w:tentative="1">
+      <w:start w:val="1"/>
+      <w:numFmt w:val="decimal"/>
+      <w:lvlText w:val="%8."/>
+      <w:lvlJc w:val="left"/>
+      <w:pPr>
+        <w:tabs>
+          <w:tab w:val="num" w:pos="5760"/>
+        </w:tabs>
+        <w:ind w:left="5760" w:hanging="360"/>
+      </w:pPr>
+    </w:lvl>
+    <w:lvl w:ilvl="8" w:tentative="1">
+      <w:start w:val="1"/>
+      <w:numFmt w:val="decimal"/>
+      <w:lvlText w:val="%9."/>
+      <w:lvlJc w:val="left"/>
+      <w:pPr>
+        <w:tabs>
+          <w:tab w:val="num" w:pos="6480"/>
+        </w:tabs>
+        <w:ind w:left="6480" w:hanging="360"/>
+      </w:pPr>
+    </w:lvl>
+  </w:abstractNum>
+  <w:abstractNum w:abstractNumId="16" w15:restartNumberingAfterBreak="0">
     <w:nsid w:val="2F700EAD"/>
     <w:multiLevelType w:val="multilevel"/>
     <w:tmpl w:val="49547A98"/>
@@ -11792,7 +13843,7 @@
       </w:rPr>
     </w:lvl>
   </w:abstractNum>
-  <w:abstractNum w:abstractNumId="13" w15:restartNumberingAfterBreak="0">
+  <w:abstractNum w:abstractNumId="17" w15:restartNumberingAfterBreak="0">
     <w:nsid w:val="36842903"/>
     <w:multiLevelType w:val="multilevel"/>
     <w:tmpl w:val="0A801C02"/>
@@ -11941,7 +13992,7 @@
       </w:rPr>
     </w:lvl>
   </w:abstractNum>
-  <w:abstractNum w:abstractNumId="14" w15:restartNumberingAfterBreak="0">
+  <w:abstractNum w:abstractNumId="18" w15:restartNumberingAfterBreak="0">
     <w:nsid w:val="37EE632B"/>
     <w:multiLevelType w:val="multilevel"/>
     <w:tmpl w:val="7E028EDC"/>
@@ -12090,7 +14141,156 @@
       </w:rPr>
     </w:lvl>
   </w:abstractNum>
-  <w:abstractNum w:abstractNumId="15" w15:restartNumberingAfterBreak="0">
+  <w:abstractNum w:abstractNumId="19" w15:restartNumberingAfterBreak="0">
+    <w:nsid w:val="39472408"/>
+    <w:multiLevelType w:val="multilevel"/>
+    <w:tmpl w:val="203AA678"/>
+    <w:lvl w:ilvl="0">
+      <w:start w:val="1"/>
+      <w:numFmt w:val="bullet"/>
+      <w:lvlText w:val=""/>
+      <w:lvlJc w:val="left"/>
+      <w:pPr>
+        <w:tabs>
+          <w:tab w:val="num" w:pos="720"/>
+        </w:tabs>
+        <w:ind w:left="720" w:hanging="360"/>
+      </w:pPr>
+      <w:rPr>
+        <w:rFonts w:ascii="Symbol" w:hAnsi="Symbol" w:hint="default"/>
+        <w:sz w:val="20"/>
+      </w:rPr>
+    </w:lvl>
+    <w:lvl w:ilvl="1" w:tentative="1">
+      <w:start w:val="1"/>
+      <w:numFmt w:val="bullet"/>
+      <w:lvlText w:val="o"/>
+      <w:lvlJc w:val="left"/>
+      <w:pPr>
+        <w:tabs>
+          <w:tab w:val="num" w:pos="1440"/>
+        </w:tabs>
+        <w:ind w:left="1440" w:hanging="360"/>
+      </w:pPr>
+      <w:rPr>
+        <w:rFonts w:ascii="Courier New" w:hAnsi="Courier New" w:hint="default"/>
+        <w:sz w:val="20"/>
+      </w:rPr>
+    </w:lvl>
+    <w:lvl w:ilvl="2" w:tentative="1">
+      <w:start w:val="1"/>
+      <w:numFmt w:val="bullet"/>
+      <w:lvlText w:val=""/>
+      <w:lvlJc w:val="left"/>
+      <w:pPr>
+        <w:tabs>
+          <w:tab w:val="num" w:pos="2160"/>
+        </w:tabs>
+        <w:ind w:left="2160" w:hanging="360"/>
+      </w:pPr>
+      <w:rPr>
+        <w:rFonts w:ascii="Wingdings" w:hAnsi="Wingdings" w:hint="default"/>
+        <w:sz w:val="20"/>
+      </w:rPr>
+    </w:lvl>
+    <w:lvl w:ilvl="3" w:tentative="1">
+      <w:start w:val="1"/>
+      <w:numFmt w:val="bullet"/>
+      <w:lvlText w:val=""/>
+      <w:lvlJc w:val="left"/>
+      <w:pPr>
+        <w:tabs>
+          <w:tab w:val="num" w:pos="2880"/>
+        </w:tabs>
+        <w:ind w:left="2880" w:hanging="360"/>
+      </w:pPr>
+      <w:rPr>
+        <w:rFonts w:ascii="Wingdings" w:hAnsi="Wingdings" w:hint="default"/>
+        <w:sz w:val="20"/>
+      </w:rPr>
+    </w:lvl>
+    <w:lvl w:ilvl="4" w:tentative="1">
+      <w:start w:val="1"/>
+      <w:numFmt w:val="bullet"/>
+      <w:lvlText w:val=""/>
+      <w:lvlJc w:val="left"/>
+      <w:pPr>
+        <w:tabs>
+          <w:tab w:val="num" w:pos="3600"/>
+        </w:tabs>
+        <w:ind w:left="3600" w:hanging="360"/>
+      </w:pPr>
+      <w:rPr>
+        <w:rFonts w:ascii="Wingdings" w:hAnsi="Wingdings" w:hint="default"/>
+        <w:sz w:val="20"/>
+      </w:rPr>
+    </w:lvl>
+    <w:lvl w:ilvl="5" w:tentative="1">
+      <w:start w:val="1"/>
+      <w:numFmt w:val="bullet"/>
+      <w:lvlText w:val=""/>
+      <w:lvlJc w:val="left"/>
+      <w:pPr>
+        <w:tabs>
+          <w:tab w:val="num" w:pos="4320"/>
+        </w:tabs>
+        <w:ind w:left="4320" w:hanging="360"/>
+      </w:pPr>
+      <w:rPr>
+        <w:rFonts w:ascii="Wingdings" w:hAnsi="Wingdings" w:hint="default"/>
+        <w:sz w:val="20"/>
+      </w:rPr>
+    </w:lvl>
+    <w:lvl w:ilvl="6" w:tentative="1">
+      <w:start w:val="1"/>
+      <w:numFmt w:val="bullet"/>
+      <w:lvlText w:val=""/>
+      <w:lvlJc w:val="left"/>
+      <w:pPr>
+        <w:tabs>
+          <w:tab w:val="num" w:pos="5040"/>
+        </w:tabs>
+        <w:ind w:left="5040" w:hanging="360"/>
+      </w:pPr>
+      <w:rPr>
+        <w:rFonts w:ascii="Wingdings" w:hAnsi="Wingdings" w:hint="default"/>
+        <w:sz w:val="20"/>
+      </w:rPr>
+    </w:lvl>
+    <w:lvl w:ilvl="7" w:tentative="1">
+      <w:start w:val="1"/>
+      <w:numFmt w:val="bullet"/>
+      <w:lvlText w:val=""/>
+      <w:lvlJc w:val="left"/>
+      <w:pPr>
+        <w:tabs>
+          <w:tab w:val="num" w:pos="5760"/>
+        </w:tabs>
+        <w:ind w:left="5760" w:hanging="360"/>
+      </w:pPr>
+      <w:rPr>
+        <w:rFonts w:ascii="Wingdings" w:hAnsi="Wingdings" w:hint="default"/>
+        <w:sz w:val="20"/>
+      </w:rPr>
+    </w:lvl>
+    <w:lvl w:ilvl="8" w:tentative="1">
+      <w:start w:val="1"/>
+      <w:numFmt w:val="bullet"/>
+      <w:lvlText w:val=""/>
+      <w:lvlJc w:val="left"/>
+      <w:pPr>
+        <w:tabs>
+          <w:tab w:val="num" w:pos="6480"/>
+        </w:tabs>
+        <w:ind w:left="6480" w:hanging="360"/>
+      </w:pPr>
+      <w:rPr>
+        <w:rFonts w:ascii="Wingdings" w:hAnsi="Wingdings" w:hint="default"/>
+        <w:sz w:val="20"/>
+      </w:rPr>
+    </w:lvl>
+  </w:abstractNum>
+  <w:abstractNum w:abstractNumId="20" w15:restartNumberingAfterBreak="0">
     <w:nsid w:val="3A37016E"/>
     <w:multiLevelType w:val="multilevel"/>
     <w:tmpl w:val="FED0109C"/>
@@ -12239,7 +14439,7 @@
       </w:rPr>
     </w:lvl>
   </w:abstractNum>
-  <w:abstractNum w:abstractNumId="16" w15:restartNumberingAfterBreak="0">
+  <w:abstractNum w:abstractNumId="21" w15:restartNumberingAfterBreak="0">
     <w:nsid w:val="46F44F6C"/>
     <w:multiLevelType w:val="multilevel"/>
     <w:tmpl w:val="5B38D3F6"/>
@@ -12388,7 +14588,7 @@
       </w:rPr>
     </w:lvl>
   </w:abstractNum>
-  <w:abstractNum w:abstractNumId="17" w15:restartNumberingAfterBreak="0">
+  <w:abstractNum w:abstractNumId="22" w15:restartNumberingAfterBreak="0">
     <w:nsid w:val="52670B24"/>
     <w:multiLevelType w:val="multilevel"/>
     <w:tmpl w:val="2D82322E"/>
@@ -12537,7 +14737,7 @@
       </w:rPr>
     </w:lvl>
   </w:abstractNum>
-  <w:abstractNum w:abstractNumId="18" w15:restartNumberingAfterBreak="0">
+  <w:abstractNum w:abstractNumId="23" w15:restartNumberingAfterBreak="0">
     <w:nsid w:val="5A966644"/>
     <w:multiLevelType w:val="multilevel"/>
     <w:tmpl w:val="098E03D2"/>
@@ -12686,7 +14886,7 @@
       </w:rPr>
     </w:lvl>
   </w:abstractNum>
-  <w:abstractNum w:abstractNumId="19" w15:restartNumberingAfterBreak="0">
+  <w:abstractNum w:abstractNumId="24" w15:restartNumberingAfterBreak="0">
     <w:nsid w:val="5AAE7D8A"/>
     <w:multiLevelType w:val="multilevel"/>
     <w:tmpl w:val="BE80D41A"/>
@@ -12799,7 +14999,7 @@
       </w:pPr>
     </w:lvl>
   </w:abstractNum>
-  <w:abstractNum w:abstractNumId="20" w15:restartNumberingAfterBreak="0">
+  <w:abstractNum w:abstractNumId="25" w15:restartNumberingAfterBreak="0">
     <w:nsid w:val="5CB66B02"/>
     <w:multiLevelType w:val="multilevel"/>
     <w:tmpl w:val="DEA63230"/>
@@ -12948,7 +15148,7 @@
       </w:rPr>
     </w:lvl>
   </w:abstractNum>
-  <w:abstractNum w:abstractNumId="21" w15:restartNumberingAfterBreak="0">
+  <w:abstractNum w:abstractNumId="26" w15:restartNumberingAfterBreak="0">
     <w:nsid w:val="5E965F63"/>
     <w:multiLevelType w:val="multilevel"/>
     <w:tmpl w:val="45B6DBA6"/>
@@ -13097,7 +15297,7 @@
       </w:rPr>
     </w:lvl>
   </w:abstractNum>
-  <w:abstractNum w:abstractNumId="22" w15:restartNumberingAfterBreak="0">
+  <w:abstractNum w:abstractNumId="27" w15:restartNumberingAfterBreak="0">
     <w:nsid w:val="6A5D3840"/>
     <w:multiLevelType w:val="multilevel"/>
     <w:tmpl w:val="5656947E"/>
@@ -13246,7 +15446,156 @@
       </w:rPr>
     </w:lvl>
   </w:abstractNum>
-  <w:abstractNum w:abstractNumId="23" w15:restartNumberingAfterBreak="0">
+  <w:abstractNum w:abstractNumId="28" w15:restartNumberingAfterBreak="0">
+    <w:nsid w:val="6A713F04"/>
+    <w:multiLevelType w:val="multilevel"/>
+    <w:tmpl w:val="8A3EF1BA"/>
+    <w:lvl w:ilvl="0">
+      <w:start w:val="1"/>
+      <w:numFmt w:val="bullet"/>
+      <w:lvlText w:val=""/>
+      <w:lvlJc w:val="left"/>
+      <w:pPr>
+        <w:tabs>
+          <w:tab w:val="num" w:pos="720"/>
+        </w:tabs>
+        <w:ind w:left="720" w:hanging="360"/>
+      </w:pPr>
+      <w:rPr>
+        <w:rFonts w:ascii="Symbol" w:hAnsi="Symbol" w:hint="default"/>
+        <w:sz w:val="20"/>
+      </w:rPr>
+    </w:lvl>
+    <w:lvl w:ilvl="1" w:tentative="1">
+      <w:start w:val="1"/>
+      <w:numFmt w:val="bullet"/>
+      <w:lvlText w:val="o"/>
+      <w:lvlJc w:val="left"/>
+      <w:pPr>
+        <w:tabs>
+          <w:tab w:val="num" w:pos="1440"/>
+        </w:tabs>
+        <w:ind w:left="1440" w:hanging="360"/>
+      </w:pPr>
+      <w:rPr>
+        <w:rFonts w:ascii="Courier New" w:hAnsi="Courier New" w:hint="default"/>
+        <w:sz w:val="20"/>
+      </w:rPr>
+    </w:lvl>
+    <w:lvl w:ilvl="2" w:tentative="1">
+      <w:start w:val="1"/>
+      <w:numFmt w:val="bullet"/>
+      <w:lvlText w:val=""/>
+      <w:lvlJc w:val="left"/>
+      <w:pPr>
+        <w:tabs>
+          <w:tab w:val="num" w:pos="2160"/>
+        </w:tabs>
+        <w:ind w:left="2160" w:hanging="360"/>
+      </w:pPr>
+      <w:rPr>
+        <w:rFonts w:ascii="Wingdings" w:hAnsi="Wingdings" w:hint="default"/>
+        <w:sz w:val="20"/>
+      </w:rPr>
+    </w:lvl>
+    <w:lvl w:ilvl="3" w:tentative="1">
+      <w:start w:val="1"/>
+      <w:numFmt w:val="bullet"/>
+      <w:lvlText w:val=""/>
+      <w:lvlJc w:val="left"/>
+      <w:pPr>
+        <w:tabs>
+          <w:tab w:val="num" w:pos="2880"/>
+        </w:tabs>
+        <w:ind w:left="2880" w:hanging="360"/>
+      </w:pPr>
+      <w:rPr>
+        <w:rFonts w:ascii="Wingdings" w:hAnsi="Wingdings" w:hint="default"/>
+        <w:sz w:val="20"/>
+      </w:rPr>
+    </w:lvl>
+    <w:lvl w:ilvl="4" w:tentative="1">
+      <w:start w:val="1"/>
+      <w:numFmt w:val="bullet"/>
+      <w:lvlText w:val=""/>
+      <w:lvlJc w:val="left"/>
+      <w:pPr>
+        <w:tabs>
+          <w:tab w:val="num" w:pos="3600"/>
+        </w:tabs>
+        <w:ind w:left="3600" w:hanging="360"/>
+      </w:pPr>
+      <w:rPr>
+        <w:rFonts w:ascii="Wingdings" w:hAnsi="Wingdings" w:hint="default"/>
+        <w:sz w:val="20"/>
+      </w:rPr>
+    </w:lvl>
+    <w:lvl w:ilvl="5" w:tentative="1">
+      <w:start w:val="1"/>
+      <w:numFmt w:val="bullet"/>
+      <w:lvlText w:val=""/>
+      <w:lvlJc w:val="left"/>
+      <w:pPr>
+        <w:tabs>
+          <w:tab w:val="num" w:pos="4320"/>
+        </w:tabs>
+        <w:ind w:left="4320" w:hanging="360"/>
+      </w:pPr>
+      <w:rPr>
+        <w:rFonts w:ascii="Wingdings" w:hAnsi="Wingdings" w:hint="default"/>
+        <w:sz w:val="20"/>
+      </w:rPr>
+    </w:lvl>
+    <w:lvl w:ilvl="6" w:tentative="1">
+      <w:start w:val="1"/>
+      <w:numFmt w:val="bullet"/>
+      <w:lvlText w:val=""/>
+      <w:lvlJc w:val="left"/>
+      <w:pPr>
+        <w:tabs>
+          <w:tab w:val="num" w:pos="5040"/>
+        </w:tabs>
+        <w:ind w:left="5040" w:hanging="360"/>
+      </w:pPr>
+      <w:rPr>
+        <w:rFonts w:ascii="Wingdings" w:hAnsi="Wingdings" w:hint="default"/>
+        <w:sz w:val="20"/>
+      </w:rPr>
+    </w:lvl>
+    <w:lvl w:ilvl="7" w:tentative="1">
+      <w:start w:val="1"/>
+      <w:numFmt w:val="bullet"/>
+      <w:lvlText w:val=""/>
+      <w:lvlJc w:val="left"/>
+      <w:pPr>
+        <w:tabs>
+          <w:tab w:val="num" w:pos="5760"/>
+        </w:tabs>
+        <w:ind w:left="5760" w:hanging="360"/>
+      </w:pPr>
+      <w:rPr>
+        <w:rFonts w:ascii="Wingdings" w:hAnsi="Wingdings" w:hint="default"/>
+        <w:sz w:val="20"/>
+      </w:rPr>
+    </w:lvl>
+    <w:lvl w:ilvl="8" w:tentative="1">
+      <w:start w:val="1"/>
+      <w:numFmt w:val="bullet"/>
+      <w:lvlText w:val=""/>
+      <w:lvlJc w:val="left"/>
+      <w:pPr>
+        <w:tabs>
+          <w:tab w:val="num" w:pos="6480"/>
+        </w:tabs>
+        <w:ind w:left="6480" w:hanging="360"/>
+      </w:pPr>
+      <w:rPr>
+        <w:rFonts w:ascii="Wingdings" w:hAnsi="Wingdings" w:hint="default"/>
+        <w:sz w:val="20"/>
+      </w:rPr>
+    </w:lvl>
+  </w:abstractNum>
+  <w:abstractNum w:abstractNumId="29" w15:restartNumberingAfterBreak="0">
     <w:nsid w:val="6B7816CE"/>
     <w:multiLevelType w:val="multilevel"/>
     <w:tmpl w:val="329601C4"/>
@@ -13395,7 +15744,120 @@
       </w:rPr>
     </w:lvl>
   </w:abstractNum>
-  <w:abstractNum w:abstractNumId="24" w15:restartNumberingAfterBreak="0">
+  <w:abstractNum w:abstractNumId="30" w15:restartNumberingAfterBreak="0">
+    <w:nsid w:val="6E8E07BB"/>
+    <w:multiLevelType w:val="multilevel"/>
+    <w:tmpl w:val="8A1AA7DA"/>
+    <w:lvl w:ilvl="0">
+      <w:start w:val="1"/>
+      <w:numFmt w:val="decimal"/>
+      <w:lvlText w:val="%1."/>
+      <w:lvlJc w:val="left"/>
+      <w:pPr>
+        <w:tabs>
+          <w:tab w:val="num" w:pos="720"/>
+        </w:tabs>
+        <w:ind w:left="720" w:hanging="360"/>
+      </w:pPr>
+    </w:lvl>
+    <w:lvl w:ilvl="1" w:tentative="1">
+      <w:start w:val="1"/>
+      <w:numFmt w:val="decimal"/>
+      <w:lvlText w:val="%2."/>
+      <w:lvlJc w:val="left"/>
+      <w:pPr>
+        <w:tabs>
+          <w:tab w:val="num" w:pos="1440"/>
+        </w:tabs>
+        <w:ind w:left="1440" w:hanging="360"/>
+      </w:pPr>
+    </w:lvl>
+    <w:lvl w:ilvl="2" w:tentative="1">
+      <w:start w:val="1"/>
+      <w:numFmt w:val="decimal"/>
+      <w:lvlText w:val="%3."/>
+      <w:lvlJc w:val="left"/>
+      <w:pPr>
+        <w:tabs>
+          <w:tab w:val="num" w:pos="2160"/>
+        </w:tabs>
+        <w:ind w:left="2160" w:hanging="360"/>
+      </w:pPr>
+    </w:lvl>
+    <w:lvl w:ilvl="3" w:tentative="1">
+      <w:start w:val="1"/>
+      <w:numFmt w:val="decimal"/>
+      <w:lvlText w:val="%4."/>
+      <w:lvlJc w:val="left"/>
+      <w:pPr>
+        <w:tabs>
+          <w:tab w:val="num" w:pos="2880"/>
+        </w:tabs>
+        <w:ind w:left="2880" w:hanging="360"/>
+      </w:pPr>
+    </w:lvl>
+    <w:lvl w:ilvl="4" w:tentative="1">
+      <w:start w:val="1"/>
+      <w:numFmt w:val="decimal"/>
+      <w:lvlText w:val="%5."/>
+      <w:lvlJc w:val="left"/>
+      <w:pPr>
+        <w:tabs>
+          <w:tab w:val="num" w:pos="3600"/>
+        </w:tabs>
+        <w:ind w:left="3600" w:hanging="360"/>
+      </w:pPr>
+    </w:lvl>
+    <w:lvl w:ilvl="5" w:tentative="1">
+      <w:start w:val="1"/>
+      <w:numFmt w:val="decimal"/>
+      <w:lvlText w:val="%6."/>
+      <w:lvlJc w:val="left"/>
+      <w:pPr>
+        <w:tabs>
+          <w:tab w:val="num" w:pos="4320"/>
+        </w:tabs>
+        <w:ind w:left="4320" w:hanging="360"/>
+      </w:pPr>
+    </w:lvl>
+    <w:lvl w:ilvl="6" w:tentative="1">
+      <w:start w:val="1"/>
+      <w:numFmt w:val="decimal"/>
+      <w:lvlText w:val="%7."/>
+      <w:lvlJc w:val="left"/>
+      <w:pPr>
+        <w:tabs>
+          <w:tab w:val="num" w:pos="5040"/>
+        </w:tabs>
+        <w:ind w:left="5040" w:hanging="360"/>
+      </w:pPr>
+    </w:lvl>
+    <w:lvl w:ilvl="7" w:tentative="1">
+      <w:start w:val="1"/>
+      <w:numFmt w:val="decimal"/>
+      <w:lvlText w:val="%8."/>
+      <w:lvlJc w:val="left"/>
+      <w:pPr>
+        <w:tabs>
+          <w:tab w:val="num" w:pos="5760"/>
+        </w:tabs>
+        <w:ind w:left="5760" w:hanging="360"/>
+      </w:pPr>
+    </w:lvl>
+    <w:lvl w:ilvl="8" w:tentative="1">
+      <w:start w:val="1"/>
+      <w:numFmt w:val="decimal"/>
+      <w:lvlText w:val="%9."/>
+      <w:lvlJc w:val="left"/>
+      <w:pPr>
+        <w:tabs>
+          <w:tab w:val="num" w:pos="6480"/>
+        </w:tabs>
+        <w:ind w:left="6480" w:hanging="360"/>
+      </w:pPr>
+    </w:lvl>
+  </w:abstractNum>
+  <w:abstractNum w:abstractNumId="31" w15:restartNumberingAfterBreak="0">
     <w:nsid w:val="74147315"/>
     <w:multiLevelType w:val="multilevel"/>
     <w:tmpl w:val="6F740E48"/>
@@ -13544,80 +16006,253 @@
       </w:rPr>
     </w:lvl>
   </w:abstractNum>
+  <w:abstractNum w:abstractNumId="32" w15:restartNumberingAfterBreak="0">
+    <w:nsid w:val="7F1935DC"/>
+    <w:multiLevelType w:val="multilevel"/>
+    <w:tmpl w:val="FC6E8F46"/>
+    <w:lvl w:ilvl="0">
+      <w:start w:val="1"/>
+      <w:numFmt w:val="bullet"/>
+      <w:lvlText w:val=""/>
+      <w:lvlJc w:val="left"/>
+      <w:pPr>
+        <w:tabs>
+          <w:tab w:val="num" w:pos="720"/>
+        </w:tabs>
+        <w:ind w:left="720" w:hanging="360"/>
+      </w:pPr>
+      <w:rPr>
+        <w:rFonts w:ascii="Symbol" w:hAnsi="Symbol" w:hint="default"/>
+        <w:sz w:val="20"/>
+      </w:rPr>
+    </w:lvl>
+    <w:lvl w:ilvl="1" w:tentative="1">
+      <w:start w:val="1"/>
+      <w:numFmt w:val="bullet"/>
+      <w:lvlText w:val="o"/>
+      <w:lvlJc w:val="left"/>
+      <w:pPr>
+        <w:tabs>
+          <w:tab w:val="num" w:pos="1440"/>
+        </w:tabs>
+        <w:ind w:left="1440" w:hanging="360"/>
+      </w:pPr>
+      <w:rPr>
+        <w:rFonts w:ascii="Courier New" w:hAnsi="Courier New" w:hint="default"/>
+        <w:sz w:val="20"/>
+      </w:rPr>
+    </w:lvl>
+    <w:lvl w:ilvl="2" w:tentative="1">
+      <w:start w:val="1"/>
+      <w:numFmt w:val="bullet"/>
+      <w:lvlText w:val=""/>
+      <w:lvlJc w:val="left"/>
+      <w:pPr>
+        <w:tabs>
+          <w:tab w:val="num" w:pos="2160"/>
+        </w:tabs>
+        <w:ind w:left="2160" w:hanging="360"/>
+      </w:pPr>
+      <w:rPr>
+        <w:rFonts w:ascii="Wingdings" w:hAnsi="Wingdings" w:hint="default"/>
+        <w:sz w:val="20"/>
+      </w:rPr>
+    </w:lvl>
+    <w:lvl w:ilvl="3" w:tentative="1">
+      <w:start w:val="1"/>
+      <w:numFmt w:val="bullet"/>
+      <w:lvlText w:val=""/>
+      <w:lvlJc w:val="left"/>
+      <w:pPr>
+        <w:tabs>
+          <w:tab w:val="num" w:pos="2880"/>
+        </w:tabs>
+        <w:ind w:left="2880" w:hanging="360"/>
+      </w:pPr>
+      <w:rPr>
+        <w:rFonts w:ascii="Wingdings" w:hAnsi="Wingdings" w:hint="default"/>
+        <w:sz w:val="20"/>
+      </w:rPr>
+    </w:lvl>
+    <w:lvl w:ilvl="4" w:tentative="1">
+      <w:start w:val="1"/>
+      <w:numFmt w:val="bullet"/>
+      <w:lvlText w:val=""/>
+      <w:lvlJc w:val="left"/>
+      <w:pPr>
+        <w:tabs>
+          <w:tab w:val="num" w:pos="3600"/>
+        </w:tabs>
+        <w:ind w:left="3600" w:hanging="360"/>
+      </w:pPr>
+      <w:rPr>
+        <w:rFonts w:ascii="Wingdings" w:hAnsi="Wingdings" w:hint="default"/>
+        <w:sz w:val="20"/>
+      </w:rPr>
+    </w:lvl>
+    <w:lvl w:ilvl="5" w:tentative="1">
+      <w:start w:val="1"/>
+      <w:numFmt w:val="bullet"/>
+      <w:lvlText w:val=""/>
+      <w:lvlJc w:val="left"/>
+      <w:pPr>
+        <w:tabs>
+          <w:tab w:val="num" w:pos="4320"/>
+        </w:tabs>
+        <w:ind w:left="4320" w:hanging="360"/>
+      </w:pPr>
+      <w:rPr>
+        <w:rFonts w:ascii="Wingdings" w:hAnsi="Wingdings" w:hint="default"/>
+        <w:sz w:val="20"/>
+      </w:rPr>
+    </w:lvl>
+    <w:lvl w:ilvl="6" w:tentative="1">
+      <w:start w:val="1"/>
+      <w:numFmt w:val="bullet"/>
+      <w:lvlText w:val=""/>
+      <w:lvlJc w:val="left"/>
+      <w:pPr>
+        <w:tabs>
+          <w:tab w:val="num" w:pos="5040"/>
+        </w:tabs>
+        <w:ind w:left="5040" w:hanging="360"/>
+      </w:pPr>
+      <w:rPr>
+        <w:rFonts w:ascii="Wingdings" w:hAnsi="Wingdings" w:hint="default"/>
+        <w:sz w:val="20"/>
+      </w:rPr>
+    </w:lvl>
+    <w:lvl w:ilvl="7" w:tentative="1">
+      <w:start w:val="1"/>
+      <w:numFmt w:val="bullet"/>
+      <w:lvlText w:val=""/>
+      <w:lvlJc w:val="left"/>
+      <w:pPr>
+        <w:tabs>
+          <w:tab w:val="num" w:pos="5760"/>
+        </w:tabs>
+        <w:ind w:left="5760" w:hanging="360"/>
+      </w:pPr>
+      <w:rPr>
+        <w:rFonts w:ascii="Wingdings" w:hAnsi="Wingdings" w:hint="default"/>
+        <w:sz w:val="20"/>
+      </w:rPr>
+    </w:lvl>
+    <w:lvl w:ilvl="8" w:tentative="1">
+      <w:start w:val="1"/>
+      <w:numFmt w:val="bullet"/>
+      <w:lvlText w:val=""/>
+      <w:lvlJc w:val="left"/>
+      <w:pPr>
+        <w:tabs>
+          <w:tab w:val="num" w:pos="6480"/>
+        </w:tabs>
+        <w:ind w:left="6480" w:hanging="360"/>
+      </w:pPr>
+      <w:rPr>
+        <w:rFonts w:ascii="Wingdings" w:hAnsi="Wingdings" w:hint="default"/>
+        <w:sz w:val="20"/>
+      </w:rPr>
+    </w:lvl>
+  </w:abstractNum>
   <w:num w:numId="1" w16cid:durableId="360476470">
-    <w:abstractNumId w:val="3"/>
+    <w:abstractNumId w:val="4"/>
   </w:num>
   <w:num w:numId="2" w16cid:durableId="474762724">
-    <w:abstractNumId w:val="14"/>
+    <w:abstractNumId w:val="18"/>
   </w:num>
   <w:num w:numId="3" w16cid:durableId="85460938">
-    <w:abstractNumId w:val="21"/>
+    <w:abstractNumId w:val="26"/>
   </w:num>
   <w:num w:numId="4" w16cid:durableId="31344530">
     <w:abstractNumId w:val="2"/>
   </w:num>
   <w:num w:numId="5" w16cid:durableId="1002271487">
-    <w:abstractNumId w:val="4"/>
+    <w:abstractNumId w:val="5"/>
   </w:num>
   <w:num w:numId="6" w16cid:durableId="458186887">
+    <w:abstractNumId w:val="21"/>
+  </w:num>
+  <w:num w:numId="7" w16cid:durableId="219560681">
+    <w:abstractNumId w:val="29"/>
+  </w:num>
+  <w:num w:numId="8" w16cid:durableId="1360007293">
+    <w:abstractNumId w:val="20"/>
+  </w:num>
+  <w:num w:numId="9" w16cid:durableId="1895771200">
+    <w:abstractNumId w:val="17"/>
+  </w:num>
+  <w:num w:numId="10" w16cid:durableId="1839345551">
+    <w:abstractNumId w:val="23"/>
+  </w:num>
+  <w:num w:numId="11" w16cid:durableId="377248438">
+    <w:abstractNumId w:val="14"/>
+  </w:num>
+  <w:num w:numId="12" w16cid:durableId="912934930">
+    <w:abstractNumId w:val="22"/>
+  </w:num>
+  <w:num w:numId="13" w16cid:durableId="1737430941">
+    <w:abstractNumId w:val="13"/>
+  </w:num>
+  <w:num w:numId="14" w16cid:durableId="1590036881">
+    <w:abstractNumId w:val="7"/>
+  </w:num>
+  <w:num w:numId="15" w16cid:durableId="99953949">
+    <w:abstractNumId w:val="10"/>
+  </w:num>
+  <w:num w:numId="16" w16cid:durableId="998190836">
     <w:abstractNumId w:val="16"/>
   </w:num>
-  <w:num w:numId="7" w16cid:durableId="219560681">
-    <w:abstractNumId w:val="23"/>
-  </w:num>
-  <w:num w:numId="8" w16cid:durableId="1360007293">
-    <w:abstractNumId w:val="15"/>
-  </w:num>
-  <w:num w:numId="9" w16cid:durableId="1895771200">
-    <w:abstractNumId w:val="13"/>
-  </w:num>
-  <w:num w:numId="10" w16cid:durableId="1839345551">
-    <w:abstractNumId w:val="18"/>
-  </w:num>
-  <w:num w:numId="11" w16cid:durableId="377248438">
-    <w:abstractNumId w:val="11"/>
-  </w:num>
-  <w:num w:numId="12" w16cid:durableId="912934930">
-    <w:abstractNumId w:val="17"/>
-  </w:num>
-  <w:num w:numId="13" w16cid:durableId="1737430941">
-    <w:abstractNumId w:val="10"/>
-  </w:num>
-  <w:num w:numId="14" w16cid:durableId="1590036881">
-    <w:abstractNumId w:val="5"/>
-  </w:num>
-  <w:num w:numId="15" w16cid:durableId="99953949">
-    <w:abstractNumId w:val="7"/>
-  </w:num>
-  <w:num w:numId="16" w16cid:durableId="998190836">
-    <w:abstractNumId w:val="12"/>
-  </w:num>
   <w:num w:numId="17" w16cid:durableId="1788544703">
-    <w:abstractNumId w:val="20"/>
+    <w:abstractNumId w:val="25"/>
   </w:num>
   <w:num w:numId="18" w16cid:durableId="2076007477">
     <w:abstractNumId w:val="0"/>
   </w:num>
   <w:num w:numId="19" w16cid:durableId="59988570">
-    <w:abstractNumId w:val="8"/>
+    <w:abstractNumId w:val="11"/>
   </w:num>
   <w:num w:numId="20" w16cid:durableId="400715520">
+    <w:abstractNumId w:val="31"/>
+  </w:num>
+  <w:num w:numId="21" w16cid:durableId="1346909014">
     <w:abstractNumId w:val="24"/>
   </w:num>
-  <w:num w:numId="21" w16cid:durableId="1346909014">
-    <w:abstractNumId w:val="19"/>
-  </w:num>
   <w:num w:numId="22" w16cid:durableId="477377515">
-    <w:abstractNumId w:val="22"/>
+    <w:abstractNumId w:val="27"/>
   </w:num>
   <w:num w:numId="23" w16cid:durableId="647051149">
     <w:abstractNumId w:val="1"/>
   </w:num>
   <w:num w:numId="24" w16cid:durableId="254367681">
+    <w:abstractNumId w:val="12"/>
+  </w:num>
+  <w:num w:numId="25" w16cid:durableId="668606061">
+    <w:abstractNumId w:val="8"/>
+  </w:num>
+  <w:num w:numId="26" w16cid:durableId="1421175831">
     <w:abstractNumId w:val="9"/>
   </w:num>
-  <w:num w:numId="25" w16cid:durableId="668606061">
+  <w:num w:numId="27" w16cid:durableId="855636">
+    <w:abstractNumId w:val="30"/>
+  </w:num>
+  <w:num w:numId="28" w16cid:durableId="44107395">
+    <w:abstractNumId w:val="28"/>
+  </w:num>
+  <w:num w:numId="29" w16cid:durableId="2041977243">
+    <w:abstractNumId w:val="3"/>
+  </w:num>
+  <w:num w:numId="30" w16cid:durableId="1395739012">
     <w:abstractNumId w:val="6"/>
+  </w:num>
+  <w:num w:numId="31" w16cid:durableId="1797600056">
+    <w:abstractNumId w:val="32"/>
+  </w:num>
+  <w:num w:numId="32" w16cid:durableId="254020596">
+    <w:abstractNumId w:val="15"/>
+  </w:num>
+  <w:num w:numId="33" w16cid:durableId="1665236230">
+    <w:abstractNumId w:val="19"/>
   </w:num>
 </w:numbering>
 </file>

</xml_diff>